<commit_message>
Add Watch My Content section with QR codes to all three deliverables
TikTok's domain is blocked by network policy and can't be embedded in a
static PDF/Word doc anyway, so scannable/clickable QR codes generated
locally are used instead, linking out to all 14 clips.
</commit_message>
<xml_diff>
--- a/media-kit/Alexis_UGC_Media_Kit.docx
+++ b/media-kit/Alexis_UGC_Media_Kit.docx
@@ -145,7 +145,7 @@
         <w:pBdr>
           <w:bottom w:val="single" w:color="E0338C" w:sz="8" w:space="4"/>
         </w:pBdr>
-        <w:spacing w:after="55" w:before="130"/>
+        <w:spacing w:after="40" w:before="100"/>
       </w:pPr>
       <w:r>
         <w:rPr>
@@ -179,7 +179,7 @@
         <w:pBdr>
           <w:bottom w:val="single" w:color="E0338C" w:sz="8" w:space="4"/>
         </w:pBdr>
-        <w:spacing w:after="55" w:before="130"/>
+        <w:spacing w:after="40" w:before="100"/>
       </w:pPr>
       <w:r>
         <w:rPr>
@@ -331,7 +331,1180 @@
         <w:pBdr>
           <w:bottom w:val="single" w:color="E0338C" w:sz="8" w:space="4"/>
         </w:pBdr>
-        <w:spacing w:after="55" w:before="130"/>
+        <w:spacing w:after="40" w:before="100"/>
+      </w:pPr>
+      <w:r>
+        <w:rPr>
+          <w:rFonts w:ascii="Calibri" w:cs="Calibri" w:eastAsia="Calibri" w:hAnsi="Calibri"/>
+          <w:b/>
+          <w:bCs/>
+          <w:color w:val="B0206B"/>
+          <w:spacing w:val="20"/>
+          <w:sz w:val="20"/>
+          <w:szCs w:val="20"/>
+        </w:rPr>
+        <w:t xml:space="preserve">WATCH MY CONTENT</w:t>
+      </w:r>
+    </w:p>
+    <w:p>
+      <w:pPr>
+        <w:spacing w:after="60"/>
+      </w:pPr>
+      <w:r>
+        <w:rPr>
+          <w:rFonts w:ascii="Calibri" w:cs="Calibri" w:eastAsia="Calibri" w:hAnsi="Calibri"/>
+          <w:i/>
+          <w:iCs/>
+          <w:color w:val="6B6B70"/>
+          <w:sz w:val="18"/>
+          <w:szCs w:val="18"/>
+        </w:rPr>
+        <w:t xml:space="preserve">Scan any code to watch — a mix of GRWM, DJ practice, and real treatment updates.</w:t>
+      </w:r>
+    </w:p>
+    <w:tbl>
+      <w:tblPr>
+        <w:tblW w:type="dxa" w:w="10840"/>
+        <w:tblBorders>
+          <w:top w:val="none" w:color="FFFFFF" w:sz="0"/>
+          <w:left w:val="none" w:color="FFFFFF" w:sz="0"/>
+          <w:bottom w:val="none" w:color="FFFFFF" w:sz="0"/>
+          <w:right w:val="none" w:color="FFFFFF" w:sz="0"/>
+          <w:insideH w:val="single" w:color="auto" w:sz="4"/>
+          <w:insideV w:val="single" w:color="auto" w:sz="4"/>
+        </w:tblBorders>
+      </w:tblPr>
+      <w:tblGrid>
+        <w:gridCol w:w="774"/>
+        <w:gridCol w:w="774"/>
+        <w:gridCol w:w="774"/>
+        <w:gridCol w:w="774"/>
+        <w:gridCol w:w="774"/>
+        <w:gridCol w:w="774"/>
+        <w:gridCol w:w="774"/>
+        <w:gridCol w:w="774"/>
+        <w:gridCol w:w="774"/>
+        <w:gridCol w:w="774"/>
+        <w:gridCol w:w="774"/>
+        <w:gridCol w:w="774"/>
+        <w:gridCol w:w="774"/>
+        <w:gridCol w:w="774"/>
+      </w:tblGrid>
+      <w:tr>
+        <w:tc>
+          <w:tcPr>
+            <w:tcW w:type="dxa" w:w="774"/>
+            <w:tcBorders>
+              <w:top w:val="none" w:color="FFFFFF" w:sz="0"/>
+              <w:left w:val="none" w:color="FFFFFF" w:sz="0"/>
+              <w:bottom w:val="none" w:color="FFFFFF" w:sz="0"/>
+              <w:right w:val="none" w:color="FFFFFF" w:sz="0"/>
+            </w:tcBorders>
+            <w:tcMar>
+              <w:top w:type="dxa" w:w="30"/>
+              <w:left w:type="dxa" w:w="20"/>
+              <w:bottom w:type="dxa" w:w="30"/>
+              <w:right w:type="dxa" w:w="20"/>
+            </w:tcMar>
+          </w:tcPr>
+          <w:p>
+            <w:pPr>
+              <w:jc w:val="center"/>
+            </w:pPr>
+            <w:r>
+              <w:drawing>
+                <wp:inline distT="0" distB="0" distL="0" distR="0">
+                  <wp:extent cx="381000" cy="381000"/>
+                  <wp:effectExtent t="0" r="0" b="0" l="0"/>
+                  <wp:docPr id="1" name="" descr="" title=""/>
+                  <wp:cNvGraphicFramePr>
+                    <a:graphicFrameLocks xmlns:a="http://schemas.openxmlformats.org/drawingml/2006/main" noChangeAspect="1"/>
+                  </wp:cNvGraphicFramePr>
+                  <a:graphic xmlns:a="http://schemas.openxmlformats.org/drawingml/2006/main">
+                    <a:graphicData uri="http://schemas.openxmlformats.org/drawingml/2006/picture">
+                      <pic:pic xmlns:pic="http://schemas.openxmlformats.org/drawingml/2006/picture">
+                        <pic:nvPicPr>
+                          <pic:cNvPr id="0" name="" descr=""/>
+                          <pic:cNvPicPr>
+                            <a:picLocks noChangeAspect="1" noChangeArrowheads="1"/>
+                          </pic:cNvPicPr>
+                        </pic:nvPicPr>
+                        <pic:blipFill>
+                          <a:blip r:embed="rId7" cstate="none"/>
+                          <a:srcRect/>
+                          <a:stretch>
+                            <a:fillRect/>
+                          </a:stretch>
+                        </pic:blipFill>
+                        <pic:spPr bwMode="auto">
+                          <a:xfrm>
+                            <a:off x="0" y="0"/>
+                            <a:ext cx="381000" cy="381000"/>
+                          </a:xfrm>
+                          <a:prstGeom prst="rect">
+                            <a:avLst/>
+                          </a:prstGeom>
+                        </pic:spPr>
+                      </pic:pic>
+                    </a:graphicData>
+                  </a:graphic>
+                </wp:inline>
+              </w:drawing>
+            </w:r>
+          </w:p>
+          <w:p>
+            <w:pPr>
+              <w:spacing w:before="15"/>
+              <w:jc w:val="center"/>
+            </w:pPr>
+            <w:r>
+              <w:rPr>
+                <w:rFonts w:ascii="Calibri" w:cs="Calibri" w:eastAsia="Calibri" w:hAnsi="Calibri"/>
+                <w:b/>
+                <w:bCs/>
+                <w:color w:val="B0206B"/>
+                <w:sz w:val="11"/>
+                <w:szCs w:val="11"/>
+              </w:rPr>
+              <w:t xml:space="preserve">01</w:t>
+            </w:r>
+          </w:p>
+        </w:tc>
+        <w:tc>
+          <w:tcPr>
+            <w:tcW w:type="dxa" w:w="774"/>
+            <w:tcBorders>
+              <w:top w:val="none" w:color="FFFFFF" w:sz="0"/>
+              <w:left w:val="none" w:color="FFFFFF" w:sz="0"/>
+              <w:bottom w:val="none" w:color="FFFFFF" w:sz="0"/>
+              <w:right w:val="none" w:color="FFFFFF" w:sz="0"/>
+            </w:tcBorders>
+            <w:tcMar>
+              <w:top w:type="dxa" w:w="30"/>
+              <w:left w:type="dxa" w:w="20"/>
+              <w:bottom w:type="dxa" w:w="30"/>
+              <w:right w:type="dxa" w:w="20"/>
+            </w:tcMar>
+          </w:tcPr>
+          <w:p>
+            <w:pPr>
+              <w:jc w:val="center"/>
+            </w:pPr>
+            <w:r>
+              <w:drawing>
+                <wp:inline distT="0" distB="0" distL="0" distR="0">
+                  <wp:extent cx="381000" cy="381000"/>
+                  <wp:effectExtent t="0" r="0" b="0" l="0"/>
+                  <wp:docPr id="1" name="" descr="" title=""/>
+                  <wp:cNvGraphicFramePr>
+                    <a:graphicFrameLocks xmlns:a="http://schemas.openxmlformats.org/drawingml/2006/main" noChangeAspect="1"/>
+                  </wp:cNvGraphicFramePr>
+                  <a:graphic xmlns:a="http://schemas.openxmlformats.org/drawingml/2006/main">
+                    <a:graphicData uri="http://schemas.openxmlformats.org/drawingml/2006/picture">
+                      <pic:pic xmlns:pic="http://schemas.openxmlformats.org/drawingml/2006/picture">
+                        <pic:nvPicPr>
+                          <pic:cNvPr id="0" name="" descr=""/>
+                          <pic:cNvPicPr>
+                            <a:picLocks noChangeAspect="1" noChangeArrowheads="1"/>
+                          </pic:cNvPicPr>
+                        </pic:nvPicPr>
+                        <pic:blipFill>
+                          <a:blip r:embed="rId8" cstate="none"/>
+                          <a:srcRect/>
+                          <a:stretch>
+                            <a:fillRect/>
+                          </a:stretch>
+                        </pic:blipFill>
+                        <pic:spPr bwMode="auto">
+                          <a:xfrm>
+                            <a:off x="0" y="0"/>
+                            <a:ext cx="381000" cy="381000"/>
+                          </a:xfrm>
+                          <a:prstGeom prst="rect">
+                            <a:avLst/>
+                          </a:prstGeom>
+                        </pic:spPr>
+                      </pic:pic>
+                    </a:graphicData>
+                  </a:graphic>
+                </wp:inline>
+              </w:drawing>
+            </w:r>
+          </w:p>
+          <w:p>
+            <w:pPr>
+              <w:spacing w:before="15"/>
+              <w:jc w:val="center"/>
+            </w:pPr>
+            <w:r>
+              <w:rPr>
+                <w:rFonts w:ascii="Calibri" w:cs="Calibri" w:eastAsia="Calibri" w:hAnsi="Calibri"/>
+                <w:b/>
+                <w:bCs/>
+                <w:color w:val="B0206B"/>
+                <w:sz w:val="11"/>
+                <w:szCs w:val="11"/>
+              </w:rPr>
+              <w:t xml:space="preserve">02</w:t>
+            </w:r>
+          </w:p>
+        </w:tc>
+        <w:tc>
+          <w:tcPr>
+            <w:tcW w:type="dxa" w:w="774"/>
+            <w:tcBorders>
+              <w:top w:val="none" w:color="FFFFFF" w:sz="0"/>
+              <w:left w:val="none" w:color="FFFFFF" w:sz="0"/>
+              <w:bottom w:val="none" w:color="FFFFFF" w:sz="0"/>
+              <w:right w:val="none" w:color="FFFFFF" w:sz="0"/>
+            </w:tcBorders>
+            <w:tcMar>
+              <w:top w:type="dxa" w:w="30"/>
+              <w:left w:type="dxa" w:w="20"/>
+              <w:bottom w:type="dxa" w:w="30"/>
+              <w:right w:type="dxa" w:w="20"/>
+            </w:tcMar>
+          </w:tcPr>
+          <w:p>
+            <w:pPr>
+              <w:jc w:val="center"/>
+            </w:pPr>
+            <w:r>
+              <w:drawing>
+                <wp:inline distT="0" distB="0" distL="0" distR="0">
+                  <wp:extent cx="381000" cy="381000"/>
+                  <wp:effectExtent t="0" r="0" b="0" l="0"/>
+                  <wp:docPr id="1" name="" descr="" title=""/>
+                  <wp:cNvGraphicFramePr>
+                    <a:graphicFrameLocks xmlns:a="http://schemas.openxmlformats.org/drawingml/2006/main" noChangeAspect="1"/>
+                  </wp:cNvGraphicFramePr>
+                  <a:graphic xmlns:a="http://schemas.openxmlformats.org/drawingml/2006/main">
+                    <a:graphicData uri="http://schemas.openxmlformats.org/drawingml/2006/picture">
+                      <pic:pic xmlns:pic="http://schemas.openxmlformats.org/drawingml/2006/picture">
+                        <pic:nvPicPr>
+                          <pic:cNvPr id="0" name="" descr=""/>
+                          <pic:cNvPicPr>
+                            <a:picLocks noChangeAspect="1" noChangeArrowheads="1"/>
+                          </pic:cNvPicPr>
+                        </pic:nvPicPr>
+                        <pic:blipFill>
+                          <a:blip r:embed="rId9" cstate="none"/>
+                          <a:srcRect/>
+                          <a:stretch>
+                            <a:fillRect/>
+                          </a:stretch>
+                        </pic:blipFill>
+                        <pic:spPr bwMode="auto">
+                          <a:xfrm>
+                            <a:off x="0" y="0"/>
+                            <a:ext cx="381000" cy="381000"/>
+                          </a:xfrm>
+                          <a:prstGeom prst="rect">
+                            <a:avLst/>
+                          </a:prstGeom>
+                        </pic:spPr>
+                      </pic:pic>
+                    </a:graphicData>
+                  </a:graphic>
+                </wp:inline>
+              </w:drawing>
+            </w:r>
+          </w:p>
+          <w:p>
+            <w:pPr>
+              <w:spacing w:before="15"/>
+              <w:jc w:val="center"/>
+            </w:pPr>
+            <w:r>
+              <w:rPr>
+                <w:rFonts w:ascii="Calibri" w:cs="Calibri" w:eastAsia="Calibri" w:hAnsi="Calibri"/>
+                <w:b/>
+                <w:bCs/>
+                <w:color w:val="B0206B"/>
+                <w:sz w:val="11"/>
+                <w:szCs w:val="11"/>
+              </w:rPr>
+              <w:t xml:space="preserve">03</w:t>
+            </w:r>
+          </w:p>
+        </w:tc>
+        <w:tc>
+          <w:tcPr>
+            <w:tcW w:type="dxa" w:w="774"/>
+            <w:tcBorders>
+              <w:top w:val="none" w:color="FFFFFF" w:sz="0"/>
+              <w:left w:val="none" w:color="FFFFFF" w:sz="0"/>
+              <w:bottom w:val="none" w:color="FFFFFF" w:sz="0"/>
+              <w:right w:val="none" w:color="FFFFFF" w:sz="0"/>
+            </w:tcBorders>
+            <w:tcMar>
+              <w:top w:type="dxa" w:w="30"/>
+              <w:left w:type="dxa" w:w="20"/>
+              <w:bottom w:type="dxa" w:w="30"/>
+              <w:right w:type="dxa" w:w="20"/>
+            </w:tcMar>
+          </w:tcPr>
+          <w:p>
+            <w:pPr>
+              <w:jc w:val="center"/>
+            </w:pPr>
+            <w:r>
+              <w:drawing>
+                <wp:inline distT="0" distB="0" distL="0" distR="0">
+                  <wp:extent cx="381000" cy="381000"/>
+                  <wp:effectExtent t="0" r="0" b="0" l="0"/>
+                  <wp:docPr id="1" name="" descr="" title=""/>
+                  <wp:cNvGraphicFramePr>
+                    <a:graphicFrameLocks xmlns:a="http://schemas.openxmlformats.org/drawingml/2006/main" noChangeAspect="1"/>
+                  </wp:cNvGraphicFramePr>
+                  <a:graphic xmlns:a="http://schemas.openxmlformats.org/drawingml/2006/main">
+                    <a:graphicData uri="http://schemas.openxmlformats.org/drawingml/2006/picture">
+                      <pic:pic xmlns:pic="http://schemas.openxmlformats.org/drawingml/2006/picture">
+                        <pic:nvPicPr>
+                          <pic:cNvPr id="0" name="" descr=""/>
+                          <pic:cNvPicPr>
+                            <a:picLocks noChangeAspect="1" noChangeArrowheads="1"/>
+                          </pic:cNvPicPr>
+                        </pic:nvPicPr>
+                        <pic:blipFill>
+                          <a:blip r:embed="rId10" cstate="none"/>
+                          <a:srcRect/>
+                          <a:stretch>
+                            <a:fillRect/>
+                          </a:stretch>
+                        </pic:blipFill>
+                        <pic:spPr bwMode="auto">
+                          <a:xfrm>
+                            <a:off x="0" y="0"/>
+                            <a:ext cx="381000" cy="381000"/>
+                          </a:xfrm>
+                          <a:prstGeom prst="rect">
+                            <a:avLst/>
+                          </a:prstGeom>
+                        </pic:spPr>
+                      </pic:pic>
+                    </a:graphicData>
+                  </a:graphic>
+                </wp:inline>
+              </w:drawing>
+            </w:r>
+          </w:p>
+          <w:p>
+            <w:pPr>
+              <w:spacing w:before="15"/>
+              <w:jc w:val="center"/>
+            </w:pPr>
+            <w:r>
+              <w:rPr>
+                <w:rFonts w:ascii="Calibri" w:cs="Calibri" w:eastAsia="Calibri" w:hAnsi="Calibri"/>
+                <w:b/>
+                <w:bCs/>
+                <w:color w:val="B0206B"/>
+                <w:sz w:val="11"/>
+                <w:szCs w:val="11"/>
+              </w:rPr>
+              <w:t xml:space="preserve">04</w:t>
+            </w:r>
+          </w:p>
+        </w:tc>
+        <w:tc>
+          <w:tcPr>
+            <w:tcW w:type="dxa" w:w="774"/>
+            <w:tcBorders>
+              <w:top w:val="none" w:color="FFFFFF" w:sz="0"/>
+              <w:left w:val="none" w:color="FFFFFF" w:sz="0"/>
+              <w:bottom w:val="none" w:color="FFFFFF" w:sz="0"/>
+              <w:right w:val="none" w:color="FFFFFF" w:sz="0"/>
+            </w:tcBorders>
+            <w:tcMar>
+              <w:top w:type="dxa" w:w="30"/>
+              <w:left w:type="dxa" w:w="20"/>
+              <w:bottom w:type="dxa" w:w="30"/>
+              <w:right w:type="dxa" w:w="20"/>
+            </w:tcMar>
+          </w:tcPr>
+          <w:p>
+            <w:pPr>
+              <w:jc w:val="center"/>
+            </w:pPr>
+            <w:r>
+              <w:drawing>
+                <wp:inline distT="0" distB="0" distL="0" distR="0">
+                  <wp:extent cx="381000" cy="381000"/>
+                  <wp:effectExtent t="0" r="0" b="0" l="0"/>
+                  <wp:docPr id="1" name="" descr="" title=""/>
+                  <wp:cNvGraphicFramePr>
+                    <a:graphicFrameLocks xmlns:a="http://schemas.openxmlformats.org/drawingml/2006/main" noChangeAspect="1"/>
+                  </wp:cNvGraphicFramePr>
+                  <a:graphic xmlns:a="http://schemas.openxmlformats.org/drawingml/2006/main">
+                    <a:graphicData uri="http://schemas.openxmlformats.org/drawingml/2006/picture">
+                      <pic:pic xmlns:pic="http://schemas.openxmlformats.org/drawingml/2006/picture">
+                        <pic:nvPicPr>
+                          <pic:cNvPr id="0" name="" descr=""/>
+                          <pic:cNvPicPr>
+                            <a:picLocks noChangeAspect="1" noChangeArrowheads="1"/>
+                          </pic:cNvPicPr>
+                        </pic:nvPicPr>
+                        <pic:blipFill>
+                          <a:blip r:embed="rId11" cstate="none"/>
+                          <a:srcRect/>
+                          <a:stretch>
+                            <a:fillRect/>
+                          </a:stretch>
+                        </pic:blipFill>
+                        <pic:spPr bwMode="auto">
+                          <a:xfrm>
+                            <a:off x="0" y="0"/>
+                            <a:ext cx="381000" cy="381000"/>
+                          </a:xfrm>
+                          <a:prstGeom prst="rect">
+                            <a:avLst/>
+                          </a:prstGeom>
+                        </pic:spPr>
+                      </pic:pic>
+                    </a:graphicData>
+                  </a:graphic>
+                </wp:inline>
+              </w:drawing>
+            </w:r>
+          </w:p>
+          <w:p>
+            <w:pPr>
+              <w:spacing w:before="15"/>
+              <w:jc w:val="center"/>
+            </w:pPr>
+            <w:r>
+              <w:rPr>
+                <w:rFonts w:ascii="Calibri" w:cs="Calibri" w:eastAsia="Calibri" w:hAnsi="Calibri"/>
+                <w:b/>
+                <w:bCs/>
+                <w:color w:val="B0206B"/>
+                <w:sz w:val="11"/>
+                <w:szCs w:val="11"/>
+              </w:rPr>
+              <w:t xml:space="preserve">05</w:t>
+            </w:r>
+          </w:p>
+        </w:tc>
+        <w:tc>
+          <w:tcPr>
+            <w:tcW w:type="dxa" w:w="774"/>
+            <w:tcBorders>
+              <w:top w:val="none" w:color="FFFFFF" w:sz="0"/>
+              <w:left w:val="none" w:color="FFFFFF" w:sz="0"/>
+              <w:bottom w:val="none" w:color="FFFFFF" w:sz="0"/>
+              <w:right w:val="none" w:color="FFFFFF" w:sz="0"/>
+            </w:tcBorders>
+            <w:tcMar>
+              <w:top w:type="dxa" w:w="30"/>
+              <w:left w:type="dxa" w:w="20"/>
+              <w:bottom w:type="dxa" w:w="30"/>
+              <w:right w:type="dxa" w:w="20"/>
+            </w:tcMar>
+          </w:tcPr>
+          <w:p>
+            <w:pPr>
+              <w:jc w:val="center"/>
+            </w:pPr>
+            <w:r>
+              <w:drawing>
+                <wp:inline distT="0" distB="0" distL="0" distR="0">
+                  <wp:extent cx="381000" cy="381000"/>
+                  <wp:effectExtent t="0" r="0" b="0" l="0"/>
+                  <wp:docPr id="1" name="" descr="" title=""/>
+                  <wp:cNvGraphicFramePr>
+                    <a:graphicFrameLocks xmlns:a="http://schemas.openxmlformats.org/drawingml/2006/main" noChangeAspect="1"/>
+                  </wp:cNvGraphicFramePr>
+                  <a:graphic xmlns:a="http://schemas.openxmlformats.org/drawingml/2006/main">
+                    <a:graphicData uri="http://schemas.openxmlformats.org/drawingml/2006/picture">
+                      <pic:pic xmlns:pic="http://schemas.openxmlformats.org/drawingml/2006/picture">
+                        <pic:nvPicPr>
+                          <pic:cNvPr id="0" name="" descr=""/>
+                          <pic:cNvPicPr>
+                            <a:picLocks noChangeAspect="1" noChangeArrowheads="1"/>
+                          </pic:cNvPicPr>
+                        </pic:nvPicPr>
+                        <pic:blipFill>
+                          <a:blip r:embed="rId12" cstate="none"/>
+                          <a:srcRect/>
+                          <a:stretch>
+                            <a:fillRect/>
+                          </a:stretch>
+                        </pic:blipFill>
+                        <pic:spPr bwMode="auto">
+                          <a:xfrm>
+                            <a:off x="0" y="0"/>
+                            <a:ext cx="381000" cy="381000"/>
+                          </a:xfrm>
+                          <a:prstGeom prst="rect">
+                            <a:avLst/>
+                          </a:prstGeom>
+                        </pic:spPr>
+                      </pic:pic>
+                    </a:graphicData>
+                  </a:graphic>
+                </wp:inline>
+              </w:drawing>
+            </w:r>
+          </w:p>
+          <w:p>
+            <w:pPr>
+              <w:spacing w:before="15"/>
+              <w:jc w:val="center"/>
+            </w:pPr>
+            <w:r>
+              <w:rPr>
+                <w:rFonts w:ascii="Calibri" w:cs="Calibri" w:eastAsia="Calibri" w:hAnsi="Calibri"/>
+                <w:b/>
+                <w:bCs/>
+                <w:color w:val="B0206B"/>
+                <w:sz w:val="11"/>
+                <w:szCs w:val="11"/>
+              </w:rPr>
+              <w:t xml:space="preserve">06</w:t>
+            </w:r>
+          </w:p>
+        </w:tc>
+        <w:tc>
+          <w:tcPr>
+            <w:tcW w:type="dxa" w:w="774"/>
+            <w:tcBorders>
+              <w:top w:val="none" w:color="FFFFFF" w:sz="0"/>
+              <w:left w:val="none" w:color="FFFFFF" w:sz="0"/>
+              <w:bottom w:val="none" w:color="FFFFFF" w:sz="0"/>
+              <w:right w:val="none" w:color="FFFFFF" w:sz="0"/>
+            </w:tcBorders>
+            <w:tcMar>
+              <w:top w:type="dxa" w:w="30"/>
+              <w:left w:type="dxa" w:w="20"/>
+              <w:bottom w:type="dxa" w:w="30"/>
+              <w:right w:type="dxa" w:w="20"/>
+            </w:tcMar>
+          </w:tcPr>
+          <w:p>
+            <w:pPr>
+              <w:jc w:val="center"/>
+            </w:pPr>
+            <w:r>
+              <w:drawing>
+                <wp:inline distT="0" distB="0" distL="0" distR="0">
+                  <wp:extent cx="381000" cy="381000"/>
+                  <wp:effectExtent t="0" r="0" b="0" l="0"/>
+                  <wp:docPr id="1" name="" descr="" title=""/>
+                  <wp:cNvGraphicFramePr>
+                    <a:graphicFrameLocks xmlns:a="http://schemas.openxmlformats.org/drawingml/2006/main" noChangeAspect="1"/>
+                  </wp:cNvGraphicFramePr>
+                  <a:graphic xmlns:a="http://schemas.openxmlformats.org/drawingml/2006/main">
+                    <a:graphicData uri="http://schemas.openxmlformats.org/drawingml/2006/picture">
+                      <pic:pic xmlns:pic="http://schemas.openxmlformats.org/drawingml/2006/picture">
+                        <pic:nvPicPr>
+                          <pic:cNvPr id="0" name="" descr=""/>
+                          <pic:cNvPicPr>
+                            <a:picLocks noChangeAspect="1" noChangeArrowheads="1"/>
+                          </pic:cNvPicPr>
+                        </pic:nvPicPr>
+                        <pic:blipFill>
+                          <a:blip r:embed="rId13" cstate="none"/>
+                          <a:srcRect/>
+                          <a:stretch>
+                            <a:fillRect/>
+                          </a:stretch>
+                        </pic:blipFill>
+                        <pic:spPr bwMode="auto">
+                          <a:xfrm>
+                            <a:off x="0" y="0"/>
+                            <a:ext cx="381000" cy="381000"/>
+                          </a:xfrm>
+                          <a:prstGeom prst="rect">
+                            <a:avLst/>
+                          </a:prstGeom>
+                        </pic:spPr>
+                      </pic:pic>
+                    </a:graphicData>
+                  </a:graphic>
+                </wp:inline>
+              </w:drawing>
+            </w:r>
+          </w:p>
+          <w:p>
+            <w:pPr>
+              <w:spacing w:before="15"/>
+              <w:jc w:val="center"/>
+            </w:pPr>
+            <w:r>
+              <w:rPr>
+                <w:rFonts w:ascii="Calibri" w:cs="Calibri" w:eastAsia="Calibri" w:hAnsi="Calibri"/>
+                <w:b/>
+                <w:bCs/>
+                <w:color w:val="B0206B"/>
+                <w:sz w:val="11"/>
+                <w:szCs w:val="11"/>
+              </w:rPr>
+              <w:t xml:space="preserve">07</w:t>
+            </w:r>
+          </w:p>
+        </w:tc>
+        <w:tc>
+          <w:tcPr>
+            <w:tcW w:type="dxa" w:w="774"/>
+            <w:tcBorders>
+              <w:top w:val="none" w:color="FFFFFF" w:sz="0"/>
+              <w:left w:val="none" w:color="FFFFFF" w:sz="0"/>
+              <w:bottom w:val="none" w:color="FFFFFF" w:sz="0"/>
+              <w:right w:val="none" w:color="FFFFFF" w:sz="0"/>
+            </w:tcBorders>
+            <w:tcMar>
+              <w:top w:type="dxa" w:w="30"/>
+              <w:left w:type="dxa" w:w="20"/>
+              <w:bottom w:type="dxa" w:w="30"/>
+              <w:right w:type="dxa" w:w="20"/>
+            </w:tcMar>
+          </w:tcPr>
+          <w:p>
+            <w:pPr>
+              <w:jc w:val="center"/>
+            </w:pPr>
+            <w:r>
+              <w:drawing>
+                <wp:inline distT="0" distB="0" distL="0" distR="0">
+                  <wp:extent cx="381000" cy="381000"/>
+                  <wp:effectExtent t="0" r="0" b="0" l="0"/>
+                  <wp:docPr id="1" name="" descr="" title=""/>
+                  <wp:cNvGraphicFramePr>
+                    <a:graphicFrameLocks xmlns:a="http://schemas.openxmlformats.org/drawingml/2006/main" noChangeAspect="1"/>
+                  </wp:cNvGraphicFramePr>
+                  <a:graphic xmlns:a="http://schemas.openxmlformats.org/drawingml/2006/main">
+                    <a:graphicData uri="http://schemas.openxmlformats.org/drawingml/2006/picture">
+                      <pic:pic xmlns:pic="http://schemas.openxmlformats.org/drawingml/2006/picture">
+                        <pic:nvPicPr>
+                          <pic:cNvPr id="0" name="" descr=""/>
+                          <pic:cNvPicPr>
+                            <a:picLocks noChangeAspect="1" noChangeArrowheads="1"/>
+                          </pic:cNvPicPr>
+                        </pic:nvPicPr>
+                        <pic:blipFill>
+                          <a:blip r:embed="rId14" cstate="none"/>
+                          <a:srcRect/>
+                          <a:stretch>
+                            <a:fillRect/>
+                          </a:stretch>
+                        </pic:blipFill>
+                        <pic:spPr bwMode="auto">
+                          <a:xfrm>
+                            <a:off x="0" y="0"/>
+                            <a:ext cx="381000" cy="381000"/>
+                          </a:xfrm>
+                          <a:prstGeom prst="rect">
+                            <a:avLst/>
+                          </a:prstGeom>
+                        </pic:spPr>
+                      </pic:pic>
+                    </a:graphicData>
+                  </a:graphic>
+                </wp:inline>
+              </w:drawing>
+            </w:r>
+          </w:p>
+          <w:p>
+            <w:pPr>
+              <w:spacing w:before="15"/>
+              <w:jc w:val="center"/>
+            </w:pPr>
+            <w:r>
+              <w:rPr>
+                <w:rFonts w:ascii="Calibri" w:cs="Calibri" w:eastAsia="Calibri" w:hAnsi="Calibri"/>
+                <w:b/>
+                <w:bCs/>
+                <w:color w:val="B0206B"/>
+                <w:sz w:val="11"/>
+                <w:szCs w:val="11"/>
+              </w:rPr>
+              <w:t xml:space="preserve">08</w:t>
+            </w:r>
+          </w:p>
+        </w:tc>
+        <w:tc>
+          <w:tcPr>
+            <w:tcW w:type="dxa" w:w="774"/>
+            <w:tcBorders>
+              <w:top w:val="none" w:color="FFFFFF" w:sz="0"/>
+              <w:left w:val="none" w:color="FFFFFF" w:sz="0"/>
+              <w:bottom w:val="none" w:color="FFFFFF" w:sz="0"/>
+              <w:right w:val="none" w:color="FFFFFF" w:sz="0"/>
+            </w:tcBorders>
+            <w:tcMar>
+              <w:top w:type="dxa" w:w="30"/>
+              <w:left w:type="dxa" w:w="20"/>
+              <w:bottom w:type="dxa" w:w="30"/>
+              <w:right w:type="dxa" w:w="20"/>
+            </w:tcMar>
+          </w:tcPr>
+          <w:p>
+            <w:pPr>
+              <w:jc w:val="center"/>
+            </w:pPr>
+            <w:r>
+              <w:drawing>
+                <wp:inline distT="0" distB="0" distL="0" distR="0">
+                  <wp:extent cx="381000" cy="381000"/>
+                  <wp:effectExtent t="0" r="0" b="0" l="0"/>
+                  <wp:docPr id="1" name="" descr="" title=""/>
+                  <wp:cNvGraphicFramePr>
+                    <a:graphicFrameLocks xmlns:a="http://schemas.openxmlformats.org/drawingml/2006/main" noChangeAspect="1"/>
+                  </wp:cNvGraphicFramePr>
+                  <a:graphic xmlns:a="http://schemas.openxmlformats.org/drawingml/2006/main">
+                    <a:graphicData uri="http://schemas.openxmlformats.org/drawingml/2006/picture">
+                      <pic:pic xmlns:pic="http://schemas.openxmlformats.org/drawingml/2006/picture">
+                        <pic:nvPicPr>
+                          <pic:cNvPr id="0" name="" descr=""/>
+                          <pic:cNvPicPr>
+                            <a:picLocks noChangeAspect="1" noChangeArrowheads="1"/>
+                          </pic:cNvPicPr>
+                        </pic:nvPicPr>
+                        <pic:blipFill>
+                          <a:blip r:embed="rId15" cstate="none"/>
+                          <a:srcRect/>
+                          <a:stretch>
+                            <a:fillRect/>
+                          </a:stretch>
+                        </pic:blipFill>
+                        <pic:spPr bwMode="auto">
+                          <a:xfrm>
+                            <a:off x="0" y="0"/>
+                            <a:ext cx="381000" cy="381000"/>
+                          </a:xfrm>
+                          <a:prstGeom prst="rect">
+                            <a:avLst/>
+                          </a:prstGeom>
+                        </pic:spPr>
+                      </pic:pic>
+                    </a:graphicData>
+                  </a:graphic>
+                </wp:inline>
+              </w:drawing>
+            </w:r>
+          </w:p>
+          <w:p>
+            <w:pPr>
+              <w:spacing w:before="15"/>
+              <w:jc w:val="center"/>
+            </w:pPr>
+            <w:r>
+              <w:rPr>
+                <w:rFonts w:ascii="Calibri" w:cs="Calibri" w:eastAsia="Calibri" w:hAnsi="Calibri"/>
+                <w:b/>
+                <w:bCs/>
+                <w:color w:val="B0206B"/>
+                <w:sz w:val="11"/>
+                <w:szCs w:val="11"/>
+              </w:rPr>
+              <w:t xml:space="preserve">09</w:t>
+            </w:r>
+          </w:p>
+        </w:tc>
+        <w:tc>
+          <w:tcPr>
+            <w:tcW w:type="dxa" w:w="774"/>
+            <w:tcBorders>
+              <w:top w:val="none" w:color="FFFFFF" w:sz="0"/>
+              <w:left w:val="none" w:color="FFFFFF" w:sz="0"/>
+              <w:bottom w:val="none" w:color="FFFFFF" w:sz="0"/>
+              <w:right w:val="none" w:color="FFFFFF" w:sz="0"/>
+            </w:tcBorders>
+            <w:tcMar>
+              <w:top w:type="dxa" w:w="30"/>
+              <w:left w:type="dxa" w:w="20"/>
+              <w:bottom w:type="dxa" w:w="30"/>
+              <w:right w:type="dxa" w:w="20"/>
+            </w:tcMar>
+          </w:tcPr>
+          <w:p>
+            <w:pPr>
+              <w:jc w:val="center"/>
+            </w:pPr>
+            <w:r>
+              <w:drawing>
+                <wp:inline distT="0" distB="0" distL="0" distR="0">
+                  <wp:extent cx="381000" cy="381000"/>
+                  <wp:effectExtent t="0" r="0" b="0" l="0"/>
+                  <wp:docPr id="1" name="" descr="" title=""/>
+                  <wp:cNvGraphicFramePr>
+                    <a:graphicFrameLocks xmlns:a="http://schemas.openxmlformats.org/drawingml/2006/main" noChangeAspect="1"/>
+                  </wp:cNvGraphicFramePr>
+                  <a:graphic xmlns:a="http://schemas.openxmlformats.org/drawingml/2006/main">
+                    <a:graphicData uri="http://schemas.openxmlformats.org/drawingml/2006/picture">
+                      <pic:pic xmlns:pic="http://schemas.openxmlformats.org/drawingml/2006/picture">
+                        <pic:nvPicPr>
+                          <pic:cNvPr id="0" name="" descr=""/>
+                          <pic:cNvPicPr>
+                            <a:picLocks noChangeAspect="1" noChangeArrowheads="1"/>
+                          </pic:cNvPicPr>
+                        </pic:nvPicPr>
+                        <pic:blipFill>
+                          <a:blip r:embed="rId16" cstate="none"/>
+                          <a:srcRect/>
+                          <a:stretch>
+                            <a:fillRect/>
+                          </a:stretch>
+                        </pic:blipFill>
+                        <pic:spPr bwMode="auto">
+                          <a:xfrm>
+                            <a:off x="0" y="0"/>
+                            <a:ext cx="381000" cy="381000"/>
+                          </a:xfrm>
+                          <a:prstGeom prst="rect">
+                            <a:avLst/>
+                          </a:prstGeom>
+                        </pic:spPr>
+                      </pic:pic>
+                    </a:graphicData>
+                  </a:graphic>
+                </wp:inline>
+              </w:drawing>
+            </w:r>
+          </w:p>
+          <w:p>
+            <w:pPr>
+              <w:spacing w:before="15"/>
+              <w:jc w:val="center"/>
+            </w:pPr>
+            <w:r>
+              <w:rPr>
+                <w:rFonts w:ascii="Calibri" w:cs="Calibri" w:eastAsia="Calibri" w:hAnsi="Calibri"/>
+                <w:b/>
+                <w:bCs/>
+                <w:color w:val="B0206B"/>
+                <w:sz w:val="11"/>
+                <w:szCs w:val="11"/>
+              </w:rPr>
+              <w:t xml:space="preserve">10</w:t>
+            </w:r>
+          </w:p>
+        </w:tc>
+        <w:tc>
+          <w:tcPr>
+            <w:tcW w:type="dxa" w:w="774"/>
+            <w:tcBorders>
+              <w:top w:val="none" w:color="FFFFFF" w:sz="0"/>
+              <w:left w:val="none" w:color="FFFFFF" w:sz="0"/>
+              <w:bottom w:val="none" w:color="FFFFFF" w:sz="0"/>
+              <w:right w:val="none" w:color="FFFFFF" w:sz="0"/>
+            </w:tcBorders>
+            <w:tcMar>
+              <w:top w:type="dxa" w:w="30"/>
+              <w:left w:type="dxa" w:w="20"/>
+              <w:bottom w:type="dxa" w:w="30"/>
+              <w:right w:type="dxa" w:w="20"/>
+            </w:tcMar>
+          </w:tcPr>
+          <w:p>
+            <w:pPr>
+              <w:jc w:val="center"/>
+            </w:pPr>
+            <w:r>
+              <w:drawing>
+                <wp:inline distT="0" distB="0" distL="0" distR="0">
+                  <wp:extent cx="381000" cy="381000"/>
+                  <wp:effectExtent t="0" r="0" b="0" l="0"/>
+                  <wp:docPr id="1" name="" descr="" title=""/>
+                  <wp:cNvGraphicFramePr>
+                    <a:graphicFrameLocks xmlns:a="http://schemas.openxmlformats.org/drawingml/2006/main" noChangeAspect="1"/>
+                  </wp:cNvGraphicFramePr>
+                  <a:graphic xmlns:a="http://schemas.openxmlformats.org/drawingml/2006/main">
+                    <a:graphicData uri="http://schemas.openxmlformats.org/drawingml/2006/picture">
+                      <pic:pic xmlns:pic="http://schemas.openxmlformats.org/drawingml/2006/picture">
+                        <pic:nvPicPr>
+                          <pic:cNvPr id="0" name="" descr=""/>
+                          <pic:cNvPicPr>
+                            <a:picLocks noChangeAspect="1" noChangeArrowheads="1"/>
+                          </pic:cNvPicPr>
+                        </pic:nvPicPr>
+                        <pic:blipFill>
+                          <a:blip r:embed="rId17" cstate="none"/>
+                          <a:srcRect/>
+                          <a:stretch>
+                            <a:fillRect/>
+                          </a:stretch>
+                        </pic:blipFill>
+                        <pic:spPr bwMode="auto">
+                          <a:xfrm>
+                            <a:off x="0" y="0"/>
+                            <a:ext cx="381000" cy="381000"/>
+                          </a:xfrm>
+                          <a:prstGeom prst="rect">
+                            <a:avLst/>
+                          </a:prstGeom>
+                        </pic:spPr>
+                      </pic:pic>
+                    </a:graphicData>
+                  </a:graphic>
+                </wp:inline>
+              </w:drawing>
+            </w:r>
+          </w:p>
+          <w:p>
+            <w:pPr>
+              <w:spacing w:before="15"/>
+              <w:jc w:val="center"/>
+            </w:pPr>
+            <w:r>
+              <w:rPr>
+                <w:rFonts w:ascii="Calibri" w:cs="Calibri" w:eastAsia="Calibri" w:hAnsi="Calibri"/>
+                <w:b/>
+                <w:bCs/>
+                <w:color w:val="B0206B"/>
+                <w:sz w:val="11"/>
+                <w:szCs w:val="11"/>
+              </w:rPr>
+              <w:t xml:space="preserve">11</w:t>
+            </w:r>
+          </w:p>
+        </w:tc>
+        <w:tc>
+          <w:tcPr>
+            <w:tcW w:type="dxa" w:w="774"/>
+            <w:tcBorders>
+              <w:top w:val="none" w:color="FFFFFF" w:sz="0"/>
+              <w:left w:val="none" w:color="FFFFFF" w:sz="0"/>
+              <w:bottom w:val="none" w:color="FFFFFF" w:sz="0"/>
+              <w:right w:val="none" w:color="FFFFFF" w:sz="0"/>
+            </w:tcBorders>
+            <w:tcMar>
+              <w:top w:type="dxa" w:w="30"/>
+              <w:left w:type="dxa" w:w="20"/>
+              <w:bottom w:type="dxa" w:w="30"/>
+              <w:right w:type="dxa" w:w="20"/>
+            </w:tcMar>
+          </w:tcPr>
+          <w:p>
+            <w:pPr>
+              <w:jc w:val="center"/>
+            </w:pPr>
+            <w:r>
+              <w:drawing>
+                <wp:inline distT="0" distB="0" distL="0" distR="0">
+                  <wp:extent cx="381000" cy="381000"/>
+                  <wp:effectExtent t="0" r="0" b="0" l="0"/>
+                  <wp:docPr id="1" name="" descr="" title=""/>
+                  <wp:cNvGraphicFramePr>
+                    <a:graphicFrameLocks xmlns:a="http://schemas.openxmlformats.org/drawingml/2006/main" noChangeAspect="1"/>
+                  </wp:cNvGraphicFramePr>
+                  <a:graphic xmlns:a="http://schemas.openxmlformats.org/drawingml/2006/main">
+                    <a:graphicData uri="http://schemas.openxmlformats.org/drawingml/2006/picture">
+                      <pic:pic xmlns:pic="http://schemas.openxmlformats.org/drawingml/2006/picture">
+                        <pic:nvPicPr>
+                          <pic:cNvPr id="0" name="" descr=""/>
+                          <pic:cNvPicPr>
+                            <a:picLocks noChangeAspect="1" noChangeArrowheads="1"/>
+                          </pic:cNvPicPr>
+                        </pic:nvPicPr>
+                        <pic:blipFill>
+                          <a:blip r:embed="rId18" cstate="none"/>
+                          <a:srcRect/>
+                          <a:stretch>
+                            <a:fillRect/>
+                          </a:stretch>
+                        </pic:blipFill>
+                        <pic:spPr bwMode="auto">
+                          <a:xfrm>
+                            <a:off x="0" y="0"/>
+                            <a:ext cx="381000" cy="381000"/>
+                          </a:xfrm>
+                          <a:prstGeom prst="rect">
+                            <a:avLst/>
+                          </a:prstGeom>
+                        </pic:spPr>
+                      </pic:pic>
+                    </a:graphicData>
+                  </a:graphic>
+                </wp:inline>
+              </w:drawing>
+            </w:r>
+          </w:p>
+          <w:p>
+            <w:pPr>
+              <w:spacing w:before="15"/>
+              <w:jc w:val="center"/>
+            </w:pPr>
+            <w:r>
+              <w:rPr>
+                <w:rFonts w:ascii="Calibri" w:cs="Calibri" w:eastAsia="Calibri" w:hAnsi="Calibri"/>
+                <w:b/>
+                <w:bCs/>
+                <w:color w:val="B0206B"/>
+                <w:sz w:val="11"/>
+                <w:szCs w:val="11"/>
+              </w:rPr>
+              <w:t xml:space="preserve">12</w:t>
+            </w:r>
+          </w:p>
+        </w:tc>
+        <w:tc>
+          <w:tcPr>
+            <w:tcW w:type="dxa" w:w="774"/>
+            <w:tcBorders>
+              <w:top w:val="none" w:color="FFFFFF" w:sz="0"/>
+              <w:left w:val="none" w:color="FFFFFF" w:sz="0"/>
+              <w:bottom w:val="none" w:color="FFFFFF" w:sz="0"/>
+              <w:right w:val="none" w:color="FFFFFF" w:sz="0"/>
+            </w:tcBorders>
+            <w:tcMar>
+              <w:top w:type="dxa" w:w="30"/>
+              <w:left w:type="dxa" w:w="20"/>
+              <w:bottom w:type="dxa" w:w="30"/>
+              <w:right w:type="dxa" w:w="20"/>
+            </w:tcMar>
+          </w:tcPr>
+          <w:p>
+            <w:pPr>
+              <w:jc w:val="center"/>
+            </w:pPr>
+            <w:r>
+              <w:drawing>
+                <wp:inline distT="0" distB="0" distL="0" distR="0">
+                  <wp:extent cx="381000" cy="381000"/>
+                  <wp:effectExtent t="0" r="0" b="0" l="0"/>
+                  <wp:docPr id="1" name="" descr="" title=""/>
+                  <wp:cNvGraphicFramePr>
+                    <a:graphicFrameLocks xmlns:a="http://schemas.openxmlformats.org/drawingml/2006/main" noChangeAspect="1"/>
+                  </wp:cNvGraphicFramePr>
+                  <a:graphic xmlns:a="http://schemas.openxmlformats.org/drawingml/2006/main">
+                    <a:graphicData uri="http://schemas.openxmlformats.org/drawingml/2006/picture">
+                      <pic:pic xmlns:pic="http://schemas.openxmlformats.org/drawingml/2006/picture">
+                        <pic:nvPicPr>
+                          <pic:cNvPr id="0" name="" descr=""/>
+                          <pic:cNvPicPr>
+                            <a:picLocks noChangeAspect="1" noChangeArrowheads="1"/>
+                          </pic:cNvPicPr>
+                        </pic:nvPicPr>
+                        <pic:blipFill>
+                          <a:blip r:embed="rId19" cstate="none"/>
+                          <a:srcRect/>
+                          <a:stretch>
+                            <a:fillRect/>
+                          </a:stretch>
+                        </pic:blipFill>
+                        <pic:spPr bwMode="auto">
+                          <a:xfrm>
+                            <a:off x="0" y="0"/>
+                            <a:ext cx="381000" cy="381000"/>
+                          </a:xfrm>
+                          <a:prstGeom prst="rect">
+                            <a:avLst/>
+                          </a:prstGeom>
+                        </pic:spPr>
+                      </pic:pic>
+                    </a:graphicData>
+                  </a:graphic>
+                </wp:inline>
+              </w:drawing>
+            </w:r>
+          </w:p>
+          <w:p>
+            <w:pPr>
+              <w:spacing w:before="15"/>
+              <w:jc w:val="center"/>
+            </w:pPr>
+            <w:r>
+              <w:rPr>
+                <w:rFonts w:ascii="Calibri" w:cs="Calibri" w:eastAsia="Calibri" w:hAnsi="Calibri"/>
+                <w:b/>
+                <w:bCs/>
+                <w:color w:val="B0206B"/>
+                <w:sz w:val="11"/>
+                <w:szCs w:val="11"/>
+              </w:rPr>
+              <w:t xml:space="preserve">13</w:t>
+            </w:r>
+          </w:p>
+        </w:tc>
+        <w:tc>
+          <w:tcPr>
+            <w:tcW w:type="dxa" w:w="774"/>
+            <w:tcBorders>
+              <w:top w:val="none" w:color="FFFFFF" w:sz="0"/>
+              <w:left w:val="none" w:color="FFFFFF" w:sz="0"/>
+              <w:bottom w:val="none" w:color="FFFFFF" w:sz="0"/>
+              <w:right w:val="none" w:color="FFFFFF" w:sz="0"/>
+            </w:tcBorders>
+            <w:tcMar>
+              <w:top w:type="dxa" w:w="30"/>
+              <w:left w:type="dxa" w:w="20"/>
+              <w:bottom w:type="dxa" w:w="30"/>
+              <w:right w:type="dxa" w:w="20"/>
+            </w:tcMar>
+          </w:tcPr>
+          <w:p>
+            <w:pPr>
+              <w:jc w:val="center"/>
+            </w:pPr>
+            <w:r>
+              <w:drawing>
+                <wp:inline distT="0" distB="0" distL="0" distR="0">
+                  <wp:extent cx="381000" cy="381000"/>
+                  <wp:effectExtent t="0" r="0" b="0" l="0"/>
+                  <wp:docPr id="1" name="" descr="" title=""/>
+                  <wp:cNvGraphicFramePr>
+                    <a:graphicFrameLocks xmlns:a="http://schemas.openxmlformats.org/drawingml/2006/main" noChangeAspect="1"/>
+                  </wp:cNvGraphicFramePr>
+                  <a:graphic xmlns:a="http://schemas.openxmlformats.org/drawingml/2006/main">
+                    <a:graphicData uri="http://schemas.openxmlformats.org/drawingml/2006/picture">
+                      <pic:pic xmlns:pic="http://schemas.openxmlformats.org/drawingml/2006/picture">
+                        <pic:nvPicPr>
+                          <pic:cNvPr id="0" name="" descr=""/>
+                          <pic:cNvPicPr>
+                            <a:picLocks noChangeAspect="1" noChangeArrowheads="1"/>
+                          </pic:cNvPicPr>
+                        </pic:nvPicPr>
+                        <pic:blipFill>
+                          <a:blip r:embed="rId20" cstate="none"/>
+                          <a:srcRect/>
+                          <a:stretch>
+                            <a:fillRect/>
+                          </a:stretch>
+                        </pic:blipFill>
+                        <pic:spPr bwMode="auto">
+                          <a:xfrm>
+                            <a:off x="0" y="0"/>
+                            <a:ext cx="381000" cy="381000"/>
+                          </a:xfrm>
+                          <a:prstGeom prst="rect">
+                            <a:avLst/>
+                          </a:prstGeom>
+                        </pic:spPr>
+                      </pic:pic>
+                    </a:graphicData>
+                  </a:graphic>
+                </wp:inline>
+              </w:drawing>
+            </w:r>
+          </w:p>
+          <w:p>
+            <w:pPr>
+              <w:spacing w:before="15"/>
+              <w:jc w:val="center"/>
+            </w:pPr>
+            <w:r>
+              <w:rPr>
+                <w:rFonts w:ascii="Calibri" w:cs="Calibri" w:eastAsia="Calibri" w:hAnsi="Calibri"/>
+                <w:b/>
+                <w:bCs/>
+                <w:color w:val="B0206B"/>
+                <w:sz w:val="11"/>
+                <w:szCs w:val="11"/>
+              </w:rPr>
+              <w:t xml:space="preserve">14</w:t>
+            </w:r>
+          </w:p>
+        </w:tc>
+      </w:tr>
+    </w:tbl>
+    <w:p>
+      <w:pPr>
+        <w:pBdr>
+          <w:bottom w:val="single" w:color="E0338C" w:sz="8" w:space="4"/>
+        </w:pBdr>
+        <w:spacing w:after="40" w:before="100"/>
       </w:pPr>
       <w:r>
         <w:rPr>
@@ -615,7 +1788,7 @@
         <w:pBdr>
           <w:bottom w:val="single" w:color="E0338C" w:sz="8" w:space="4"/>
         </w:pBdr>
-        <w:spacing w:after="55" w:before="130"/>
+        <w:spacing w:after="40" w:before="100"/>
       </w:pPr>
       <w:r>
         <w:rPr>
@@ -662,7 +1835,7 @@
         <w:pBdr>
           <w:bottom w:val="single" w:color="E0338C" w:sz="8" w:space="4"/>
         </w:pBdr>
-        <w:spacing w:after="55" w:before="130"/>
+        <w:spacing w:after="40" w:before="100"/>
       </w:pPr>
       <w:r>
         <w:rPr>
@@ -959,7 +2132,7 @@
     </w:p>
     <w:sectPr>
       <w:pgSz w:w="12240" w:h="15840" w:orient="portrait"/>
-      <w:pgMar w:top="500" w:right="700" w:bottom="500" w:left="700" w:header="708" w:footer="708" w:gutter="0"/>
+      <w:pgMar w:top="420" w:right="620" w:bottom="420" w:left="620" w:header="708" w:footer="708" w:gutter="0"/>
       <w:pgNumType/>
       <w:docGrid w:linePitch="360"/>
     </w:sectPr>

</xml_diff>

<commit_message>
Replace TikTok embeds with self-hosted video players
Mirrors the same change pushed to Alexisg324/UGC: self-hosted clips
instead of TikTok embeds (which always showed unrelated "related
videos" from other creators), with real poster thumbnails and QR
codes pointing at the permanent hosted video URLs.
</commit_message>
<xml_diff>
--- a/media-kit/Alexis_UGC_Media_Kit.docx
+++ b/media-kit/Alexis_UGC_Media_Kit.docx
@@ -375,25 +375,20 @@
         </w:tblBorders>
       </w:tblPr>
       <w:tblGrid>
-        <w:gridCol w:w="774"/>
-        <w:gridCol w:w="774"/>
-        <w:gridCol w:w="774"/>
-        <w:gridCol w:w="774"/>
-        <w:gridCol w:w="774"/>
-        <w:gridCol w:w="774"/>
-        <w:gridCol w:w="774"/>
-        <w:gridCol w:w="774"/>
-        <w:gridCol w:w="774"/>
-        <w:gridCol w:w="774"/>
-        <w:gridCol w:w="774"/>
-        <w:gridCol w:w="774"/>
-        <w:gridCol w:w="774"/>
-        <w:gridCol w:w="774"/>
+        <w:gridCol w:w="1204"/>
+        <w:gridCol w:w="1204"/>
+        <w:gridCol w:w="1204"/>
+        <w:gridCol w:w="1204"/>
+        <w:gridCol w:w="1204"/>
+        <w:gridCol w:w="1204"/>
+        <w:gridCol w:w="1204"/>
+        <w:gridCol w:w="1204"/>
+        <w:gridCol w:w="1204"/>
       </w:tblGrid>
       <w:tr>
         <w:tc>
           <w:tcPr>
-            <w:tcW w:type="dxa" w:w="774"/>
+            <w:tcW w:type="dxa" w:w="1204"/>
             <w:tcBorders>
               <w:top w:val="none" w:color="FFFFFF" w:sz="0"/>
               <w:left w:val="none" w:color="FFFFFF" w:sz="0"/>
@@ -414,7 +409,7 @@
             <w:r>
               <w:drawing>
                 <wp:inline distT="0" distB="0" distL="0" distR="0">
-                  <wp:extent cx="381000" cy="381000"/>
+                  <wp:extent cx="438150" cy="438150"/>
                   <wp:effectExtent t="0" r="0" b="0" l="0"/>
                   <wp:docPr id="1" name="" descr="" title=""/>
                   <wp:cNvGraphicFramePr>
@@ -439,7 +434,7 @@
                         <pic:spPr bwMode="auto">
                           <a:xfrm>
                             <a:off x="0" y="0"/>
-                            <a:ext cx="381000" cy="381000"/>
+                            <a:ext cx="438150" cy="438150"/>
                           </a:xfrm>
                           <a:prstGeom prst="rect">
                             <a:avLst/>
@@ -472,7 +467,7 @@
         </w:tc>
         <w:tc>
           <w:tcPr>
-            <w:tcW w:type="dxa" w:w="774"/>
+            <w:tcW w:type="dxa" w:w="1204"/>
             <w:tcBorders>
               <w:top w:val="none" w:color="FFFFFF" w:sz="0"/>
               <w:left w:val="none" w:color="FFFFFF" w:sz="0"/>
@@ -493,7 +488,7 @@
             <w:r>
               <w:drawing>
                 <wp:inline distT="0" distB="0" distL="0" distR="0">
-                  <wp:extent cx="381000" cy="381000"/>
+                  <wp:extent cx="438150" cy="438150"/>
                   <wp:effectExtent t="0" r="0" b="0" l="0"/>
                   <wp:docPr id="1" name="" descr="" title=""/>
                   <wp:cNvGraphicFramePr>
@@ -518,7 +513,7 @@
                         <pic:spPr bwMode="auto">
                           <a:xfrm>
                             <a:off x="0" y="0"/>
-                            <a:ext cx="381000" cy="381000"/>
+                            <a:ext cx="438150" cy="438150"/>
                           </a:xfrm>
                           <a:prstGeom prst="rect">
                             <a:avLst/>
@@ -551,7 +546,7 @@
         </w:tc>
         <w:tc>
           <w:tcPr>
-            <w:tcW w:type="dxa" w:w="774"/>
+            <w:tcW w:type="dxa" w:w="1204"/>
             <w:tcBorders>
               <w:top w:val="none" w:color="FFFFFF" w:sz="0"/>
               <w:left w:val="none" w:color="FFFFFF" w:sz="0"/>
@@ -572,7 +567,7 @@
             <w:r>
               <w:drawing>
                 <wp:inline distT="0" distB="0" distL="0" distR="0">
-                  <wp:extent cx="381000" cy="381000"/>
+                  <wp:extent cx="438150" cy="438150"/>
                   <wp:effectExtent t="0" r="0" b="0" l="0"/>
                   <wp:docPr id="1" name="" descr="" title=""/>
                   <wp:cNvGraphicFramePr>
@@ -597,7 +592,7 @@
                         <pic:spPr bwMode="auto">
                           <a:xfrm>
                             <a:off x="0" y="0"/>
-                            <a:ext cx="381000" cy="381000"/>
+                            <a:ext cx="438150" cy="438150"/>
                           </a:xfrm>
                           <a:prstGeom prst="rect">
                             <a:avLst/>
@@ -630,7 +625,7 @@
         </w:tc>
         <w:tc>
           <w:tcPr>
-            <w:tcW w:type="dxa" w:w="774"/>
+            <w:tcW w:type="dxa" w:w="1204"/>
             <w:tcBorders>
               <w:top w:val="none" w:color="FFFFFF" w:sz="0"/>
               <w:left w:val="none" w:color="FFFFFF" w:sz="0"/>
@@ -651,7 +646,7 @@
             <w:r>
               <w:drawing>
                 <wp:inline distT="0" distB="0" distL="0" distR="0">
-                  <wp:extent cx="381000" cy="381000"/>
+                  <wp:extent cx="438150" cy="438150"/>
                   <wp:effectExtent t="0" r="0" b="0" l="0"/>
                   <wp:docPr id="1" name="" descr="" title=""/>
                   <wp:cNvGraphicFramePr>
@@ -676,7 +671,7 @@
                         <pic:spPr bwMode="auto">
                           <a:xfrm>
                             <a:off x="0" y="0"/>
-                            <a:ext cx="381000" cy="381000"/>
+                            <a:ext cx="438150" cy="438150"/>
                           </a:xfrm>
                           <a:prstGeom prst="rect">
                             <a:avLst/>
@@ -709,7 +704,7 @@
         </w:tc>
         <w:tc>
           <w:tcPr>
-            <w:tcW w:type="dxa" w:w="774"/>
+            <w:tcW w:type="dxa" w:w="1204"/>
             <w:tcBorders>
               <w:top w:val="none" w:color="FFFFFF" w:sz="0"/>
               <w:left w:val="none" w:color="FFFFFF" w:sz="0"/>
@@ -730,7 +725,7 @@
             <w:r>
               <w:drawing>
                 <wp:inline distT="0" distB="0" distL="0" distR="0">
-                  <wp:extent cx="381000" cy="381000"/>
+                  <wp:extent cx="438150" cy="438150"/>
                   <wp:effectExtent t="0" r="0" b="0" l="0"/>
                   <wp:docPr id="1" name="" descr="" title=""/>
                   <wp:cNvGraphicFramePr>
@@ -755,7 +750,7 @@
                         <pic:spPr bwMode="auto">
                           <a:xfrm>
                             <a:off x="0" y="0"/>
-                            <a:ext cx="381000" cy="381000"/>
+                            <a:ext cx="438150" cy="438150"/>
                           </a:xfrm>
                           <a:prstGeom prst="rect">
                             <a:avLst/>
@@ -788,7 +783,7 @@
         </w:tc>
         <w:tc>
           <w:tcPr>
-            <w:tcW w:type="dxa" w:w="774"/>
+            <w:tcW w:type="dxa" w:w="1204"/>
             <w:tcBorders>
               <w:top w:val="none" w:color="FFFFFF" w:sz="0"/>
               <w:left w:val="none" w:color="FFFFFF" w:sz="0"/>
@@ -809,7 +804,7 @@
             <w:r>
               <w:drawing>
                 <wp:inline distT="0" distB="0" distL="0" distR="0">
-                  <wp:extent cx="381000" cy="381000"/>
+                  <wp:extent cx="438150" cy="438150"/>
                   <wp:effectExtent t="0" r="0" b="0" l="0"/>
                   <wp:docPr id="1" name="" descr="" title=""/>
                   <wp:cNvGraphicFramePr>
@@ -834,7 +829,7 @@
                         <pic:spPr bwMode="auto">
                           <a:xfrm>
                             <a:off x="0" y="0"/>
-                            <a:ext cx="381000" cy="381000"/>
+                            <a:ext cx="438150" cy="438150"/>
                           </a:xfrm>
                           <a:prstGeom prst="rect">
                             <a:avLst/>
@@ -867,7 +862,7 @@
         </w:tc>
         <w:tc>
           <w:tcPr>
-            <w:tcW w:type="dxa" w:w="774"/>
+            <w:tcW w:type="dxa" w:w="1204"/>
             <w:tcBorders>
               <w:top w:val="none" w:color="FFFFFF" w:sz="0"/>
               <w:left w:val="none" w:color="FFFFFF" w:sz="0"/>
@@ -888,7 +883,7 @@
             <w:r>
               <w:drawing>
                 <wp:inline distT="0" distB="0" distL="0" distR="0">
-                  <wp:extent cx="381000" cy="381000"/>
+                  <wp:extent cx="438150" cy="438150"/>
                   <wp:effectExtent t="0" r="0" b="0" l="0"/>
                   <wp:docPr id="1" name="" descr="" title=""/>
                   <wp:cNvGraphicFramePr>
@@ -913,7 +908,7 @@
                         <pic:spPr bwMode="auto">
                           <a:xfrm>
                             <a:off x="0" y="0"/>
-                            <a:ext cx="381000" cy="381000"/>
+                            <a:ext cx="438150" cy="438150"/>
                           </a:xfrm>
                           <a:prstGeom prst="rect">
                             <a:avLst/>
@@ -946,7 +941,7 @@
         </w:tc>
         <w:tc>
           <w:tcPr>
-            <w:tcW w:type="dxa" w:w="774"/>
+            <w:tcW w:type="dxa" w:w="1204"/>
             <w:tcBorders>
               <w:top w:val="none" w:color="FFFFFF" w:sz="0"/>
               <w:left w:val="none" w:color="FFFFFF" w:sz="0"/>
@@ -967,7 +962,7 @@
             <w:r>
               <w:drawing>
                 <wp:inline distT="0" distB="0" distL="0" distR="0">
-                  <wp:extent cx="381000" cy="381000"/>
+                  <wp:extent cx="438150" cy="438150"/>
                   <wp:effectExtent t="0" r="0" b="0" l="0"/>
                   <wp:docPr id="1" name="" descr="" title=""/>
                   <wp:cNvGraphicFramePr>
@@ -992,7 +987,7 @@
                         <pic:spPr bwMode="auto">
                           <a:xfrm>
                             <a:off x="0" y="0"/>
-                            <a:ext cx="381000" cy="381000"/>
+                            <a:ext cx="438150" cy="438150"/>
                           </a:xfrm>
                           <a:prstGeom prst="rect">
                             <a:avLst/>
@@ -1025,7 +1020,7 @@
         </w:tc>
         <w:tc>
           <w:tcPr>
-            <w:tcW w:type="dxa" w:w="774"/>
+            <w:tcW w:type="dxa" w:w="1204"/>
             <w:tcBorders>
               <w:top w:val="none" w:color="FFFFFF" w:sz="0"/>
               <w:left w:val="none" w:color="FFFFFF" w:sz="0"/>
@@ -1046,7 +1041,7 @@
             <w:r>
               <w:drawing>
                 <wp:inline distT="0" distB="0" distL="0" distR="0">
-                  <wp:extent cx="381000" cy="381000"/>
+                  <wp:extent cx="438150" cy="438150"/>
                   <wp:effectExtent t="0" r="0" b="0" l="0"/>
                   <wp:docPr id="1" name="" descr="" title=""/>
                   <wp:cNvGraphicFramePr>
@@ -1071,7 +1066,7 @@
                         <pic:spPr bwMode="auto">
                           <a:xfrm>
                             <a:off x="0" y="0"/>
-                            <a:ext cx="381000" cy="381000"/>
+                            <a:ext cx="438150" cy="438150"/>
                           </a:xfrm>
                           <a:prstGeom prst="rect">
                             <a:avLst/>
@@ -1099,401 +1094,6 @@
                 <w:szCs w:val="11"/>
               </w:rPr>
               <w:t xml:space="preserve">09</w:t>
-            </w:r>
-          </w:p>
-        </w:tc>
-        <w:tc>
-          <w:tcPr>
-            <w:tcW w:type="dxa" w:w="774"/>
-            <w:tcBorders>
-              <w:top w:val="none" w:color="FFFFFF" w:sz="0"/>
-              <w:left w:val="none" w:color="FFFFFF" w:sz="0"/>
-              <w:bottom w:val="none" w:color="FFFFFF" w:sz="0"/>
-              <w:right w:val="none" w:color="FFFFFF" w:sz="0"/>
-            </w:tcBorders>
-            <w:tcMar>
-              <w:top w:type="dxa" w:w="30"/>
-              <w:left w:type="dxa" w:w="20"/>
-              <w:bottom w:type="dxa" w:w="30"/>
-              <w:right w:type="dxa" w:w="20"/>
-            </w:tcMar>
-          </w:tcPr>
-          <w:p>
-            <w:pPr>
-              <w:jc w:val="center"/>
-            </w:pPr>
-            <w:r>
-              <w:drawing>
-                <wp:inline distT="0" distB="0" distL="0" distR="0">
-                  <wp:extent cx="381000" cy="381000"/>
-                  <wp:effectExtent t="0" r="0" b="0" l="0"/>
-                  <wp:docPr id="1" name="" descr="" title=""/>
-                  <wp:cNvGraphicFramePr>
-                    <a:graphicFrameLocks xmlns:a="http://schemas.openxmlformats.org/drawingml/2006/main" noChangeAspect="1"/>
-                  </wp:cNvGraphicFramePr>
-                  <a:graphic xmlns:a="http://schemas.openxmlformats.org/drawingml/2006/main">
-                    <a:graphicData uri="http://schemas.openxmlformats.org/drawingml/2006/picture">
-                      <pic:pic xmlns:pic="http://schemas.openxmlformats.org/drawingml/2006/picture">
-                        <pic:nvPicPr>
-                          <pic:cNvPr id="0" name="" descr=""/>
-                          <pic:cNvPicPr>
-                            <a:picLocks noChangeAspect="1" noChangeArrowheads="1"/>
-                          </pic:cNvPicPr>
-                        </pic:nvPicPr>
-                        <pic:blipFill>
-                          <a:blip r:embed="rId16" cstate="none"/>
-                          <a:srcRect/>
-                          <a:stretch>
-                            <a:fillRect/>
-                          </a:stretch>
-                        </pic:blipFill>
-                        <pic:spPr bwMode="auto">
-                          <a:xfrm>
-                            <a:off x="0" y="0"/>
-                            <a:ext cx="381000" cy="381000"/>
-                          </a:xfrm>
-                          <a:prstGeom prst="rect">
-                            <a:avLst/>
-                          </a:prstGeom>
-                        </pic:spPr>
-                      </pic:pic>
-                    </a:graphicData>
-                  </a:graphic>
-                </wp:inline>
-              </w:drawing>
-            </w:r>
-          </w:p>
-          <w:p>
-            <w:pPr>
-              <w:spacing w:before="15"/>
-              <w:jc w:val="center"/>
-            </w:pPr>
-            <w:r>
-              <w:rPr>
-                <w:rFonts w:ascii="Calibri" w:cs="Calibri" w:eastAsia="Calibri" w:hAnsi="Calibri"/>
-                <w:b/>
-                <w:bCs/>
-                <w:color w:val="B0206B"/>
-                <w:sz w:val="11"/>
-                <w:szCs w:val="11"/>
-              </w:rPr>
-              <w:t xml:space="preserve">10</w:t>
-            </w:r>
-          </w:p>
-        </w:tc>
-        <w:tc>
-          <w:tcPr>
-            <w:tcW w:type="dxa" w:w="774"/>
-            <w:tcBorders>
-              <w:top w:val="none" w:color="FFFFFF" w:sz="0"/>
-              <w:left w:val="none" w:color="FFFFFF" w:sz="0"/>
-              <w:bottom w:val="none" w:color="FFFFFF" w:sz="0"/>
-              <w:right w:val="none" w:color="FFFFFF" w:sz="0"/>
-            </w:tcBorders>
-            <w:tcMar>
-              <w:top w:type="dxa" w:w="30"/>
-              <w:left w:type="dxa" w:w="20"/>
-              <w:bottom w:type="dxa" w:w="30"/>
-              <w:right w:type="dxa" w:w="20"/>
-            </w:tcMar>
-          </w:tcPr>
-          <w:p>
-            <w:pPr>
-              <w:jc w:val="center"/>
-            </w:pPr>
-            <w:r>
-              <w:drawing>
-                <wp:inline distT="0" distB="0" distL="0" distR="0">
-                  <wp:extent cx="381000" cy="381000"/>
-                  <wp:effectExtent t="0" r="0" b="0" l="0"/>
-                  <wp:docPr id="1" name="" descr="" title=""/>
-                  <wp:cNvGraphicFramePr>
-                    <a:graphicFrameLocks xmlns:a="http://schemas.openxmlformats.org/drawingml/2006/main" noChangeAspect="1"/>
-                  </wp:cNvGraphicFramePr>
-                  <a:graphic xmlns:a="http://schemas.openxmlformats.org/drawingml/2006/main">
-                    <a:graphicData uri="http://schemas.openxmlformats.org/drawingml/2006/picture">
-                      <pic:pic xmlns:pic="http://schemas.openxmlformats.org/drawingml/2006/picture">
-                        <pic:nvPicPr>
-                          <pic:cNvPr id="0" name="" descr=""/>
-                          <pic:cNvPicPr>
-                            <a:picLocks noChangeAspect="1" noChangeArrowheads="1"/>
-                          </pic:cNvPicPr>
-                        </pic:nvPicPr>
-                        <pic:blipFill>
-                          <a:blip r:embed="rId17" cstate="none"/>
-                          <a:srcRect/>
-                          <a:stretch>
-                            <a:fillRect/>
-                          </a:stretch>
-                        </pic:blipFill>
-                        <pic:spPr bwMode="auto">
-                          <a:xfrm>
-                            <a:off x="0" y="0"/>
-                            <a:ext cx="381000" cy="381000"/>
-                          </a:xfrm>
-                          <a:prstGeom prst="rect">
-                            <a:avLst/>
-                          </a:prstGeom>
-                        </pic:spPr>
-                      </pic:pic>
-                    </a:graphicData>
-                  </a:graphic>
-                </wp:inline>
-              </w:drawing>
-            </w:r>
-          </w:p>
-          <w:p>
-            <w:pPr>
-              <w:spacing w:before="15"/>
-              <w:jc w:val="center"/>
-            </w:pPr>
-            <w:r>
-              <w:rPr>
-                <w:rFonts w:ascii="Calibri" w:cs="Calibri" w:eastAsia="Calibri" w:hAnsi="Calibri"/>
-                <w:b/>
-                <w:bCs/>
-                <w:color w:val="B0206B"/>
-                <w:sz w:val="11"/>
-                <w:szCs w:val="11"/>
-              </w:rPr>
-              <w:t xml:space="preserve">11</w:t>
-            </w:r>
-          </w:p>
-        </w:tc>
-        <w:tc>
-          <w:tcPr>
-            <w:tcW w:type="dxa" w:w="774"/>
-            <w:tcBorders>
-              <w:top w:val="none" w:color="FFFFFF" w:sz="0"/>
-              <w:left w:val="none" w:color="FFFFFF" w:sz="0"/>
-              <w:bottom w:val="none" w:color="FFFFFF" w:sz="0"/>
-              <w:right w:val="none" w:color="FFFFFF" w:sz="0"/>
-            </w:tcBorders>
-            <w:tcMar>
-              <w:top w:type="dxa" w:w="30"/>
-              <w:left w:type="dxa" w:w="20"/>
-              <w:bottom w:type="dxa" w:w="30"/>
-              <w:right w:type="dxa" w:w="20"/>
-            </w:tcMar>
-          </w:tcPr>
-          <w:p>
-            <w:pPr>
-              <w:jc w:val="center"/>
-            </w:pPr>
-            <w:r>
-              <w:drawing>
-                <wp:inline distT="0" distB="0" distL="0" distR="0">
-                  <wp:extent cx="381000" cy="381000"/>
-                  <wp:effectExtent t="0" r="0" b="0" l="0"/>
-                  <wp:docPr id="1" name="" descr="" title=""/>
-                  <wp:cNvGraphicFramePr>
-                    <a:graphicFrameLocks xmlns:a="http://schemas.openxmlformats.org/drawingml/2006/main" noChangeAspect="1"/>
-                  </wp:cNvGraphicFramePr>
-                  <a:graphic xmlns:a="http://schemas.openxmlformats.org/drawingml/2006/main">
-                    <a:graphicData uri="http://schemas.openxmlformats.org/drawingml/2006/picture">
-                      <pic:pic xmlns:pic="http://schemas.openxmlformats.org/drawingml/2006/picture">
-                        <pic:nvPicPr>
-                          <pic:cNvPr id="0" name="" descr=""/>
-                          <pic:cNvPicPr>
-                            <a:picLocks noChangeAspect="1" noChangeArrowheads="1"/>
-                          </pic:cNvPicPr>
-                        </pic:nvPicPr>
-                        <pic:blipFill>
-                          <a:blip r:embed="rId18" cstate="none"/>
-                          <a:srcRect/>
-                          <a:stretch>
-                            <a:fillRect/>
-                          </a:stretch>
-                        </pic:blipFill>
-                        <pic:spPr bwMode="auto">
-                          <a:xfrm>
-                            <a:off x="0" y="0"/>
-                            <a:ext cx="381000" cy="381000"/>
-                          </a:xfrm>
-                          <a:prstGeom prst="rect">
-                            <a:avLst/>
-                          </a:prstGeom>
-                        </pic:spPr>
-                      </pic:pic>
-                    </a:graphicData>
-                  </a:graphic>
-                </wp:inline>
-              </w:drawing>
-            </w:r>
-          </w:p>
-          <w:p>
-            <w:pPr>
-              <w:spacing w:before="15"/>
-              <w:jc w:val="center"/>
-            </w:pPr>
-            <w:r>
-              <w:rPr>
-                <w:rFonts w:ascii="Calibri" w:cs="Calibri" w:eastAsia="Calibri" w:hAnsi="Calibri"/>
-                <w:b/>
-                <w:bCs/>
-                <w:color w:val="B0206B"/>
-                <w:sz w:val="11"/>
-                <w:szCs w:val="11"/>
-              </w:rPr>
-              <w:t xml:space="preserve">12</w:t>
-            </w:r>
-          </w:p>
-        </w:tc>
-        <w:tc>
-          <w:tcPr>
-            <w:tcW w:type="dxa" w:w="774"/>
-            <w:tcBorders>
-              <w:top w:val="none" w:color="FFFFFF" w:sz="0"/>
-              <w:left w:val="none" w:color="FFFFFF" w:sz="0"/>
-              <w:bottom w:val="none" w:color="FFFFFF" w:sz="0"/>
-              <w:right w:val="none" w:color="FFFFFF" w:sz="0"/>
-            </w:tcBorders>
-            <w:tcMar>
-              <w:top w:type="dxa" w:w="30"/>
-              <w:left w:type="dxa" w:w="20"/>
-              <w:bottom w:type="dxa" w:w="30"/>
-              <w:right w:type="dxa" w:w="20"/>
-            </w:tcMar>
-          </w:tcPr>
-          <w:p>
-            <w:pPr>
-              <w:jc w:val="center"/>
-            </w:pPr>
-            <w:r>
-              <w:drawing>
-                <wp:inline distT="0" distB="0" distL="0" distR="0">
-                  <wp:extent cx="381000" cy="381000"/>
-                  <wp:effectExtent t="0" r="0" b="0" l="0"/>
-                  <wp:docPr id="1" name="" descr="" title=""/>
-                  <wp:cNvGraphicFramePr>
-                    <a:graphicFrameLocks xmlns:a="http://schemas.openxmlformats.org/drawingml/2006/main" noChangeAspect="1"/>
-                  </wp:cNvGraphicFramePr>
-                  <a:graphic xmlns:a="http://schemas.openxmlformats.org/drawingml/2006/main">
-                    <a:graphicData uri="http://schemas.openxmlformats.org/drawingml/2006/picture">
-                      <pic:pic xmlns:pic="http://schemas.openxmlformats.org/drawingml/2006/picture">
-                        <pic:nvPicPr>
-                          <pic:cNvPr id="0" name="" descr=""/>
-                          <pic:cNvPicPr>
-                            <a:picLocks noChangeAspect="1" noChangeArrowheads="1"/>
-                          </pic:cNvPicPr>
-                        </pic:nvPicPr>
-                        <pic:blipFill>
-                          <a:blip r:embed="rId19" cstate="none"/>
-                          <a:srcRect/>
-                          <a:stretch>
-                            <a:fillRect/>
-                          </a:stretch>
-                        </pic:blipFill>
-                        <pic:spPr bwMode="auto">
-                          <a:xfrm>
-                            <a:off x="0" y="0"/>
-                            <a:ext cx="381000" cy="381000"/>
-                          </a:xfrm>
-                          <a:prstGeom prst="rect">
-                            <a:avLst/>
-                          </a:prstGeom>
-                        </pic:spPr>
-                      </pic:pic>
-                    </a:graphicData>
-                  </a:graphic>
-                </wp:inline>
-              </w:drawing>
-            </w:r>
-          </w:p>
-          <w:p>
-            <w:pPr>
-              <w:spacing w:before="15"/>
-              <w:jc w:val="center"/>
-            </w:pPr>
-            <w:r>
-              <w:rPr>
-                <w:rFonts w:ascii="Calibri" w:cs="Calibri" w:eastAsia="Calibri" w:hAnsi="Calibri"/>
-                <w:b/>
-                <w:bCs/>
-                <w:color w:val="B0206B"/>
-                <w:sz w:val="11"/>
-                <w:szCs w:val="11"/>
-              </w:rPr>
-              <w:t xml:space="preserve">13</w:t>
-            </w:r>
-          </w:p>
-        </w:tc>
-        <w:tc>
-          <w:tcPr>
-            <w:tcW w:type="dxa" w:w="774"/>
-            <w:tcBorders>
-              <w:top w:val="none" w:color="FFFFFF" w:sz="0"/>
-              <w:left w:val="none" w:color="FFFFFF" w:sz="0"/>
-              <w:bottom w:val="none" w:color="FFFFFF" w:sz="0"/>
-              <w:right w:val="none" w:color="FFFFFF" w:sz="0"/>
-            </w:tcBorders>
-            <w:tcMar>
-              <w:top w:type="dxa" w:w="30"/>
-              <w:left w:type="dxa" w:w="20"/>
-              <w:bottom w:type="dxa" w:w="30"/>
-              <w:right w:type="dxa" w:w="20"/>
-            </w:tcMar>
-          </w:tcPr>
-          <w:p>
-            <w:pPr>
-              <w:jc w:val="center"/>
-            </w:pPr>
-            <w:r>
-              <w:drawing>
-                <wp:inline distT="0" distB="0" distL="0" distR="0">
-                  <wp:extent cx="381000" cy="381000"/>
-                  <wp:effectExtent t="0" r="0" b="0" l="0"/>
-                  <wp:docPr id="1" name="" descr="" title=""/>
-                  <wp:cNvGraphicFramePr>
-                    <a:graphicFrameLocks xmlns:a="http://schemas.openxmlformats.org/drawingml/2006/main" noChangeAspect="1"/>
-                  </wp:cNvGraphicFramePr>
-                  <a:graphic xmlns:a="http://schemas.openxmlformats.org/drawingml/2006/main">
-                    <a:graphicData uri="http://schemas.openxmlformats.org/drawingml/2006/picture">
-                      <pic:pic xmlns:pic="http://schemas.openxmlformats.org/drawingml/2006/picture">
-                        <pic:nvPicPr>
-                          <pic:cNvPr id="0" name="" descr=""/>
-                          <pic:cNvPicPr>
-                            <a:picLocks noChangeAspect="1" noChangeArrowheads="1"/>
-                          </pic:cNvPicPr>
-                        </pic:nvPicPr>
-                        <pic:blipFill>
-                          <a:blip r:embed="rId20" cstate="none"/>
-                          <a:srcRect/>
-                          <a:stretch>
-                            <a:fillRect/>
-                          </a:stretch>
-                        </pic:blipFill>
-                        <pic:spPr bwMode="auto">
-                          <a:xfrm>
-                            <a:off x="0" y="0"/>
-                            <a:ext cx="381000" cy="381000"/>
-                          </a:xfrm>
-                          <a:prstGeom prst="rect">
-                            <a:avLst/>
-                          </a:prstGeom>
-                        </pic:spPr>
-                      </pic:pic>
-                    </a:graphicData>
-                  </a:graphic>
-                </wp:inline>
-              </w:drawing>
-            </w:r>
-          </w:p>
-          <w:p>
-            <w:pPr>
-              <w:spacing w:before="15"/>
-              <w:jc w:val="center"/>
-            </w:pPr>
-            <w:r>
-              <w:rPr>
-                <w:rFonts w:ascii="Calibri" w:cs="Calibri" w:eastAsia="Calibri" w:hAnsi="Calibri"/>
-                <w:b/>
-                <w:bCs/>
-                <w:color w:val="B0206B"/>
-                <w:sz w:val="11"/>
-                <w:szCs w:val="11"/>
-              </w:rPr>
-              <w:t xml:space="preserve">14</w:t>
             </w:r>
           </w:p>
         </w:tc>

</xml_diff>

<commit_message>
Update to 14 clips: remove #3, add 6 new, dedupe
Mirrors the same reorganization pushed to Alexisg324/UGC.
</commit_message>
<xml_diff>
--- a/media-kit/Alexis_UGC_Media_Kit.docx
+++ b/media-kit/Alexis_UGC_Media_Kit.docx
@@ -375,20 +375,25 @@
         </w:tblBorders>
       </w:tblPr>
       <w:tblGrid>
-        <w:gridCol w:w="1204"/>
-        <w:gridCol w:w="1204"/>
-        <w:gridCol w:w="1204"/>
-        <w:gridCol w:w="1204"/>
-        <w:gridCol w:w="1204"/>
-        <w:gridCol w:w="1204"/>
-        <w:gridCol w:w="1204"/>
-        <w:gridCol w:w="1204"/>
-        <w:gridCol w:w="1204"/>
+        <w:gridCol w:w="774"/>
+        <w:gridCol w:w="774"/>
+        <w:gridCol w:w="774"/>
+        <w:gridCol w:w="774"/>
+        <w:gridCol w:w="774"/>
+        <w:gridCol w:w="774"/>
+        <w:gridCol w:w="774"/>
+        <w:gridCol w:w="774"/>
+        <w:gridCol w:w="774"/>
+        <w:gridCol w:w="774"/>
+        <w:gridCol w:w="774"/>
+        <w:gridCol w:w="774"/>
+        <w:gridCol w:w="774"/>
+        <w:gridCol w:w="774"/>
       </w:tblGrid>
       <w:tr>
         <w:tc>
           <w:tcPr>
-            <w:tcW w:type="dxa" w:w="1204"/>
+            <w:tcW w:type="dxa" w:w="774"/>
             <w:tcBorders>
               <w:top w:val="none" w:color="FFFFFF" w:sz="0"/>
               <w:left w:val="none" w:color="FFFFFF" w:sz="0"/>
@@ -409,7 +414,7 @@
             <w:r>
               <w:drawing>
                 <wp:inline distT="0" distB="0" distL="0" distR="0">
-                  <wp:extent cx="438150" cy="438150"/>
+                  <wp:extent cx="381000" cy="381000"/>
                   <wp:effectExtent t="0" r="0" b="0" l="0"/>
                   <wp:docPr id="1" name="" descr="" title=""/>
                   <wp:cNvGraphicFramePr>
@@ -434,7 +439,7 @@
                         <pic:spPr bwMode="auto">
                           <a:xfrm>
                             <a:off x="0" y="0"/>
-                            <a:ext cx="438150" cy="438150"/>
+                            <a:ext cx="381000" cy="381000"/>
                           </a:xfrm>
                           <a:prstGeom prst="rect">
                             <a:avLst/>
@@ -467,7 +472,7 @@
         </w:tc>
         <w:tc>
           <w:tcPr>
-            <w:tcW w:type="dxa" w:w="1204"/>
+            <w:tcW w:type="dxa" w:w="774"/>
             <w:tcBorders>
               <w:top w:val="none" w:color="FFFFFF" w:sz="0"/>
               <w:left w:val="none" w:color="FFFFFF" w:sz="0"/>
@@ -488,7 +493,7 @@
             <w:r>
               <w:drawing>
                 <wp:inline distT="0" distB="0" distL="0" distR="0">
-                  <wp:extent cx="438150" cy="438150"/>
+                  <wp:extent cx="381000" cy="381000"/>
                   <wp:effectExtent t="0" r="0" b="0" l="0"/>
                   <wp:docPr id="1" name="" descr="" title=""/>
                   <wp:cNvGraphicFramePr>
@@ -513,7 +518,7 @@
                         <pic:spPr bwMode="auto">
                           <a:xfrm>
                             <a:off x="0" y="0"/>
-                            <a:ext cx="438150" cy="438150"/>
+                            <a:ext cx="381000" cy="381000"/>
                           </a:xfrm>
                           <a:prstGeom prst="rect">
                             <a:avLst/>
@@ -546,7 +551,7 @@
         </w:tc>
         <w:tc>
           <w:tcPr>
-            <w:tcW w:type="dxa" w:w="1204"/>
+            <w:tcW w:type="dxa" w:w="774"/>
             <w:tcBorders>
               <w:top w:val="none" w:color="FFFFFF" w:sz="0"/>
               <w:left w:val="none" w:color="FFFFFF" w:sz="0"/>
@@ -567,7 +572,7 @@
             <w:r>
               <w:drawing>
                 <wp:inline distT="0" distB="0" distL="0" distR="0">
-                  <wp:extent cx="438150" cy="438150"/>
+                  <wp:extent cx="381000" cy="381000"/>
                   <wp:effectExtent t="0" r="0" b="0" l="0"/>
                   <wp:docPr id="1" name="" descr="" title=""/>
                   <wp:cNvGraphicFramePr>
@@ -592,7 +597,7 @@
                         <pic:spPr bwMode="auto">
                           <a:xfrm>
                             <a:off x="0" y="0"/>
-                            <a:ext cx="438150" cy="438150"/>
+                            <a:ext cx="381000" cy="381000"/>
                           </a:xfrm>
                           <a:prstGeom prst="rect">
                             <a:avLst/>
@@ -625,7 +630,7 @@
         </w:tc>
         <w:tc>
           <w:tcPr>
-            <w:tcW w:type="dxa" w:w="1204"/>
+            <w:tcW w:type="dxa" w:w="774"/>
             <w:tcBorders>
               <w:top w:val="none" w:color="FFFFFF" w:sz="0"/>
               <w:left w:val="none" w:color="FFFFFF" w:sz="0"/>
@@ -646,7 +651,7 @@
             <w:r>
               <w:drawing>
                 <wp:inline distT="0" distB="0" distL="0" distR="0">
-                  <wp:extent cx="438150" cy="438150"/>
+                  <wp:extent cx="381000" cy="381000"/>
                   <wp:effectExtent t="0" r="0" b="0" l="0"/>
                   <wp:docPr id="1" name="" descr="" title=""/>
                   <wp:cNvGraphicFramePr>
@@ -671,7 +676,7 @@
                         <pic:spPr bwMode="auto">
                           <a:xfrm>
                             <a:off x="0" y="0"/>
-                            <a:ext cx="438150" cy="438150"/>
+                            <a:ext cx="381000" cy="381000"/>
                           </a:xfrm>
                           <a:prstGeom prst="rect">
                             <a:avLst/>
@@ -704,7 +709,7 @@
         </w:tc>
         <w:tc>
           <w:tcPr>
-            <w:tcW w:type="dxa" w:w="1204"/>
+            <w:tcW w:type="dxa" w:w="774"/>
             <w:tcBorders>
               <w:top w:val="none" w:color="FFFFFF" w:sz="0"/>
               <w:left w:val="none" w:color="FFFFFF" w:sz="0"/>
@@ -725,7 +730,7 @@
             <w:r>
               <w:drawing>
                 <wp:inline distT="0" distB="0" distL="0" distR="0">
-                  <wp:extent cx="438150" cy="438150"/>
+                  <wp:extent cx="381000" cy="381000"/>
                   <wp:effectExtent t="0" r="0" b="0" l="0"/>
                   <wp:docPr id="1" name="" descr="" title=""/>
                   <wp:cNvGraphicFramePr>
@@ -750,7 +755,7 @@
                         <pic:spPr bwMode="auto">
                           <a:xfrm>
                             <a:off x="0" y="0"/>
-                            <a:ext cx="438150" cy="438150"/>
+                            <a:ext cx="381000" cy="381000"/>
                           </a:xfrm>
                           <a:prstGeom prst="rect">
                             <a:avLst/>
@@ -783,7 +788,7 @@
         </w:tc>
         <w:tc>
           <w:tcPr>
-            <w:tcW w:type="dxa" w:w="1204"/>
+            <w:tcW w:type="dxa" w:w="774"/>
             <w:tcBorders>
               <w:top w:val="none" w:color="FFFFFF" w:sz="0"/>
               <w:left w:val="none" w:color="FFFFFF" w:sz="0"/>
@@ -804,7 +809,7 @@
             <w:r>
               <w:drawing>
                 <wp:inline distT="0" distB="0" distL="0" distR="0">
-                  <wp:extent cx="438150" cy="438150"/>
+                  <wp:extent cx="381000" cy="381000"/>
                   <wp:effectExtent t="0" r="0" b="0" l="0"/>
                   <wp:docPr id="1" name="" descr="" title=""/>
                   <wp:cNvGraphicFramePr>
@@ -829,7 +834,7 @@
                         <pic:spPr bwMode="auto">
                           <a:xfrm>
                             <a:off x="0" y="0"/>
-                            <a:ext cx="438150" cy="438150"/>
+                            <a:ext cx="381000" cy="381000"/>
                           </a:xfrm>
                           <a:prstGeom prst="rect">
                             <a:avLst/>
@@ -862,7 +867,7 @@
         </w:tc>
         <w:tc>
           <w:tcPr>
-            <w:tcW w:type="dxa" w:w="1204"/>
+            <w:tcW w:type="dxa" w:w="774"/>
             <w:tcBorders>
               <w:top w:val="none" w:color="FFFFFF" w:sz="0"/>
               <w:left w:val="none" w:color="FFFFFF" w:sz="0"/>
@@ -883,7 +888,7 @@
             <w:r>
               <w:drawing>
                 <wp:inline distT="0" distB="0" distL="0" distR="0">
-                  <wp:extent cx="438150" cy="438150"/>
+                  <wp:extent cx="381000" cy="381000"/>
                   <wp:effectExtent t="0" r="0" b="0" l="0"/>
                   <wp:docPr id="1" name="" descr="" title=""/>
                   <wp:cNvGraphicFramePr>
@@ -908,7 +913,7 @@
                         <pic:spPr bwMode="auto">
                           <a:xfrm>
                             <a:off x="0" y="0"/>
-                            <a:ext cx="438150" cy="438150"/>
+                            <a:ext cx="381000" cy="381000"/>
                           </a:xfrm>
                           <a:prstGeom prst="rect">
                             <a:avLst/>
@@ -941,7 +946,7 @@
         </w:tc>
         <w:tc>
           <w:tcPr>
-            <w:tcW w:type="dxa" w:w="1204"/>
+            <w:tcW w:type="dxa" w:w="774"/>
             <w:tcBorders>
               <w:top w:val="none" w:color="FFFFFF" w:sz="0"/>
               <w:left w:val="none" w:color="FFFFFF" w:sz="0"/>
@@ -962,7 +967,7 @@
             <w:r>
               <w:drawing>
                 <wp:inline distT="0" distB="0" distL="0" distR="0">
-                  <wp:extent cx="438150" cy="438150"/>
+                  <wp:extent cx="381000" cy="381000"/>
                   <wp:effectExtent t="0" r="0" b="0" l="0"/>
                   <wp:docPr id="1" name="" descr="" title=""/>
                   <wp:cNvGraphicFramePr>
@@ -987,7 +992,7 @@
                         <pic:spPr bwMode="auto">
                           <a:xfrm>
                             <a:off x="0" y="0"/>
-                            <a:ext cx="438150" cy="438150"/>
+                            <a:ext cx="381000" cy="381000"/>
                           </a:xfrm>
                           <a:prstGeom prst="rect">
                             <a:avLst/>
@@ -1020,7 +1025,7 @@
         </w:tc>
         <w:tc>
           <w:tcPr>
-            <w:tcW w:type="dxa" w:w="1204"/>
+            <w:tcW w:type="dxa" w:w="774"/>
             <w:tcBorders>
               <w:top w:val="none" w:color="FFFFFF" w:sz="0"/>
               <w:left w:val="none" w:color="FFFFFF" w:sz="0"/>
@@ -1041,7 +1046,7 @@
             <w:r>
               <w:drawing>
                 <wp:inline distT="0" distB="0" distL="0" distR="0">
-                  <wp:extent cx="438150" cy="438150"/>
+                  <wp:extent cx="381000" cy="381000"/>
                   <wp:effectExtent t="0" r="0" b="0" l="0"/>
                   <wp:docPr id="1" name="" descr="" title=""/>
                   <wp:cNvGraphicFramePr>
@@ -1066,7 +1071,7 @@
                         <pic:spPr bwMode="auto">
                           <a:xfrm>
                             <a:off x="0" y="0"/>
-                            <a:ext cx="438150" cy="438150"/>
+                            <a:ext cx="381000" cy="381000"/>
                           </a:xfrm>
                           <a:prstGeom prst="rect">
                             <a:avLst/>
@@ -1094,6 +1099,401 @@
                 <w:szCs w:val="11"/>
               </w:rPr>
               <w:t xml:space="preserve">09</w:t>
+            </w:r>
+          </w:p>
+        </w:tc>
+        <w:tc>
+          <w:tcPr>
+            <w:tcW w:type="dxa" w:w="774"/>
+            <w:tcBorders>
+              <w:top w:val="none" w:color="FFFFFF" w:sz="0"/>
+              <w:left w:val="none" w:color="FFFFFF" w:sz="0"/>
+              <w:bottom w:val="none" w:color="FFFFFF" w:sz="0"/>
+              <w:right w:val="none" w:color="FFFFFF" w:sz="0"/>
+            </w:tcBorders>
+            <w:tcMar>
+              <w:top w:type="dxa" w:w="30"/>
+              <w:left w:type="dxa" w:w="20"/>
+              <w:bottom w:type="dxa" w:w="30"/>
+              <w:right w:type="dxa" w:w="20"/>
+            </w:tcMar>
+          </w:tcPr>
+          <w:p>
+            <w:pPr>
+              <w:jc w:val="center"/>
+            </w:pPr>
+            <w:r>
+              <w:drawing>
+                <wp:inline distT="0" distB="0" distL="0" distR="0">
+                  <wp:extent cx="381000" cy="381000"/>
+                  <wp:effectExtent t="0" r="0" b="0" l="0"/>
+                  <wp:docPr id="1" name="" descr="" title=""/>
+                  <wp:cNvGraphicFramePr>
+                    <a:graphicFrameLocks xmlns:a="http://schemas.openxmlformats.org/drawingml/2006/main" noChangeAspect="1"/>
+                  </wp:cNvGraphicFramePr>
+                  <a:graphic xmlns:a="http://schemas.openxmlformats.org/drawingml/2006/main">
+                    <a:graphicData uri="http://schemas.openxmlformats.org/drawingml/2006/picture">
+                      <pic:pic xmlns:pic="http://schemas.openxmlformats.org/drawingml/2006/picture">
+                        <pic:nvPicPr>
+                          <pic:cNvPr id="0" name="" descr=""/>
+                          <pic:cNvPicPr>
+                            <a:picLocks noChangeAspect="1" noChangeArrowheads="1"/>
+                          </pic:cNvPicPr>
+                        </pic:nvPicPr>
+                        <pic:blipFill>
+                          <a:blip r:embed="rId16" cstate="none"/>
+                          <a:srcRect/>
+                          <a:stretch>
+                            <a:fillRect/>
+                          </a:stretch>
+                        </pic:blipFill>
+                        <pic:spPr bwMode="auto">
+                          <a:xfrm>
+                            <a:off x="0" y="0"/>
+                            <a:ext cx="381000" cy="381000"/>
+                          </a:xfrm>
+                          <a:prstGeom prst="rect">
+                            <a:avLst/>
+                          </a:prstGeom>
+                        </pic:spPr>
+                      </pic:pic>
+                    </a:graphicData>
+                  </a:graphic>
+                </wp:inline>
+              </w:drawing>
+            </w:r>
+          </w:p>
+          <w:p>
+            <w:pPr>
+              <w:spacing w:before="15"/>
+              <w:jc w:val="center"/>
+            </w:pPr>
+            <w:r>
+              <w:rPr>
+                <w:rFonts w:ascii="Calibri" w:cs="Calibri" w:eastAsia="Calibri" w:hAnsi="Calibri"/>
+                <w:b/>
+                <w:bCs/>
+                <w:color w:val="B0206B"/>
+                <w:sz w:val="11"/>
+                <w:szCs w:val="11"/>
+              </w:rPr>
+              <w:t xml:space="preserve">10</w:t>
+            </w:r>
+          </w:p>
+        </w:tc>
+        <w:tc>
+          <w:tcPr>
+            <w:tcW w:type="dxa" w:w="774"/>
+            <w:tcBorders>
+              <w:top w:val="none" w:color="FFFFFF" w:sz="0"/>
+              <w:left w:val="none" w:color="FFFFFF" w:sz="0"/>
+              <w:bottom w:val="none" w:color="FFFFFF" w:sz="0"/>
+              <w:right w:val="none" w:color="FFFFFF" w:sz="0"/>
+            </w:tcBorders>
+            <w:tcMar>
+              <w:top w:type="dxa" w:w="30"/>
+              <w:left w:type="dxa" w:w="20"/>
+              <w:bottom w:type="dxa" w:w="30"/>
+              <w:right w:type="dxa" w:w="20"/>
+            </w:tcMar>
+          </w:tcPr>
+          <w:p>
+            <w:pPr>
+              <w:jc w:val="center"/>
+            </w:pPr>
+            <w:r>
+              <w:drawing>
+                <wp:inline distT="0" distB="0" distL="0" distR="0">
+                  <wp:extent cx="381000" cy="381000"/>
+                  <wp:effectExtent t="0" r="0" b="0" l="0"/>
+                  <wp:docPr id="1" name="" descr="" title=""/>
+                  <wp:cNvGraphicFramePr>
+                    <a:graphicFrameLocks xmlns:a="http://schemas.openxmlformats.org/drawingml/2006/main" noChangeAspect="1"/>
+                  </wp:cNvGraphicFramePr>
+                  <a:graphic xmlns:a="http://schemas.openxmlformats.org/drawingml/2006/main">
+                    <a:graphicData uri="http://schemas.openxmlformats.org/drawingml/2006/picture">
+                      <pic:pic xmlns:pic="http://schemas.openxmlformats.org/drawingml/2006/picture">
+                        <pic:nvPicPr>
+                          <pic:cNvPr id="0" name="" descr=""/>
+                          <pic:cNvPicPr>
+                            <a:picLocks noChangeAspect="1" noChangeArrowheads="1"/>
+                          </pic:cNvPicPr>
+                        </pic:nvPicPr>
+                        <pic:blipFill>
+                          <a:blip r:embed="rId17" cstate="none"/>
+                          <a:srcRect/>
+                          <a:stretch>
+                            <a:fillRect/>
+                          </a:stretch>
+                        </pic:blipFill>
+                        <pic:spPr bwMode="auto">
+                          <a:xfrm>
+                            <a:off x="0" y="0"/>
+                            <a:ext cx="381000" cy="381000"/>
+                          </a:xfrm>
+                          <a:prstGeom prst="rect">
+                            <a:avLst/>
+                          </a:prstGeom>
+                        </pic:spPr>
+                      </pic:pic>
+                    </a:graphicData>
+                  </a:graphic>
+                </wp:inline>
+              </w:drawing>
+            </w:r>
+          </w:p>
+          <w:p>
+            <w:pPr>
+              <w:spacing w:before="15"/>
+              <w:jc w:val="center"/>
+            </w:pPr>
+            <w:r>
+              <w:rPr>
+                <w:rFonts w:ascii="Calibri" w:cs="Calibri" w:eastAsia="Calibri" w:hAnsi="Calibri"/>
+                <w:b/>
+                <w:bCs/>
+                <w:color w:val="B0206B"/>
+                <w:sz w:val="11"/>
+                <w:szCs w:val="11"/>
+              </w:rPr>
+              <w:t xml:space="preserve">11</w:t>
+            </w:r>
+          </w:p>
+        </w:tc>
+        <w:tc>
+          <w:tcPr>
+            <w:tcW w:type="dxa" w:w="774"/>
+            <w:tcBorders>
+              <w:top w:val="none" w:color="FFFFFF" w:sz="0"/>
+              <w:left w:val="none" w:color="FFFFFF" w:sz="0"/>
+              <w:bottom w:val="none" w:color="FFFFFF" w:sz="0"/>
+              <w:right w:val="none" w:color="FFFFFF" w:sz="0"/>
+            </w:tcBorders>
+            <w:tcMar>
+              <w:top w:type="dxa" w:w="30"/>
+              <w:left w:type="dxa" w:w="20"/>
+              <w:bottom w:type="dxa" w:w="30"/>
+              <w:right w:type="dxa" w:w="20"/>
+            </w:tcMar>
+          </w:tcPr>
+          <w:p>
+            <w:pPr>
+              <w:jc w:val="center"/>
+            </w:pPr>
+            <w:r>
+              <w:drawing>
+                <wp:inline distT="0" distB="0" distL="0" distR="0">
+                  <wp:extent cx="381000" cy="381000"/>
+                  <wp:effectExtent t="0" r="0" b="0" l="0"/>
+                  <wp:docPr id="1" name="" descr="" title=""/>
+                  <wp:cNvGraphicFramePr>
+                    <a:graphicFrameLocks xmlns:a="http://schemas.openxmlformats.org/drawingml/2006/main" noChangeAspect="1"/>
+                  </wp:cNvGraphicFramePr>
+                  <a:graphic xmlns:a="http://schemas.openxmlformats.org/drawingml/2006/main">
+                    <a:graphicData uri="http://schemas.openxmlformats.org/drawingml/2006/picture">
+                      <pic:pic xmlns:pic="http://schemas.openxmlformats.org/drawingml/2006/picture">
+                        <pic:nvPicPr>
+                          <pic:cNvPr id="0" name="" descr=""/>
+                          <pic:cNvPicPr>
+                            <a:picLocks noChangeAspect="1" noChangeArrowheads="1"/>
+                          </pic:cNvPicPr>
+                        </pic:nvPicPr>
+                        <pic:blipFill>
+                          <a:blip r:embed="rId18" cstate="none"/>
+                          <a:srcRect/>
+                          <a:stretch>
+                            <a:fillRect/>
+                          </a:stretch>
+                        </pic:blipFill>
+                        <pic:spPr bwMode="auto">
+                          <a:xfrm>
+                            <a:off x="0" y="0"/>
+                            <a:ext cx="381000" cy="381000"/>
+                          </a:xfrm>
+                          <a:prstGeom prst="rect">
+                            <a:avLst/>
+                          </a:prstGeom>
+                        </pic:spPr>
+                      </pic:pic>
+                    </a:graphicData>
+                  </a:graphic>
+                </wp:inline>
+              </w:drawing>
+            </w:r>
+          </w:p>
+          <w:p>
+            <w:pPr>
+              <w:spacing w:before="15"/>
+              <w:jc w:val="center"/>
+            </w:pPr>
+            <w:r>
+              <w:rPr>
+                <w:rFonts w:ascii="Calibri" w:cs="Calibri" w:eastAsia="Calibri" w:hAnsi="Calibri"/>
+                <w:b/>
+                <w:bCs/>
+                <w:color w:val="B0206B"/>
+                <w:sz w:val="11"/>
+                <w:szCs w:val="11"/>
+              </w:rPr>
+              <w:t xml:space="preserve">12</w:t>
+            </w:r>
+          </w:p>
+        </w:tc>
+        <w:tc>
+          <w:tcPr>
+            <w:tcW w:type="dxa" w:w="774"/>
+            <w:tcBorders>
+              <w:top w:val="none" w:color="FFFFFF" w:sz="0"/>
+              <w:left w:val="none" w:color="FFFFFF" w:sz="0"/>
+              <w:bottom w:val="none" w:color="FFFFFF" w:sz="0"/>
+              <w:right w:val="none" w:color="FFFFFF" w:sz="0"/>
+            </w:tcBorders>
+            <w:tcMar>
+              <w:top w:type="dxa" w:w="30"/>
+              <w:left w:type="dxa" w:w="20"/>
+              <w:bottom w:type="dxa" w:w="30"/>
+              <w:right w:type="dxa" w:w="20"/>
+            </w:tcMar>
+          </w:tcPr>
+          <w:p>
+            <w:pPr>
+              <w:jc w:val="center"/>
+            </w:pPr>
+            <w:r>
+              <w:drawing>
+                <wp:inline distT="0" distB="0" distL="0" distR="0">
+                  <wp:extent cx="381000" cy="381000"/>
+                  <wp:effectExtent t="0" r="0" b="0" l="0"/>
+                  <wp:docPr id="1" name="" descr="" title=""/>
+                  <wp:cNvGraphicFramePr>
+                    <a:graphicFrameLocks xmlns:a="http://schemas.openxmlformats.org/drawingml/2006/main" noChangeAspect="1"/>
+                  </wp:cNvGraphicFramePr>
+                  <a:graphic xmlns:a="http://schemas.openxmlformats.org/drawingml/2006/main">
+                    <a:graphicData uri="http://schemas.openxmlformats.org/drawingml/2006/picture">
+                      <pic:pic xmlns:pic="http://schemas.openxmlformats.org/drawingml/2006/picture">
+                        <pic:nvPicPr>
+                          <pic:cNvPr id="0" name="" descr=""/>
+                          <pic:cNvPicPr>
+                            <a:picLocks noChangeAspect="1" noChangeArrowheads="1"/>
+                          </pic:cNvPicPr>
+                        </pic:nvPicPr>
+                        <pic:blipFill>
+                          <a:blip r:embed="rId19" cstate="none"/>
+                          <a:srcRect/>
+                          <a:stretch>
+                            <a:fillRect/>
+                          </a:stretch>
+                        </pic:blipFill>
+                        <pic:spPr bwMode="auto">
+                          <a:xfrm>
+                            <a:off x="0" y="0"/>
+                            <a:ext cx="381000" cy="381000"/>
+                          </a:xfrm>
+                          <a:prstGeom prst="rect">
+                            <a:avLst/>
+                          </a:prstGeom>
+                        </pic:spPr>
+                      </pic:pic>
+                    </a:graphicData>
+                  </a:graphic>
+                </wp:inline>
+              </w:drawing>
+            </w:r>
+          </w:p>
+          <w:p>
+            <w:pPr>
+              <w:spacing w:before="15"/>
+              <w:jc w:val="center"/>
+            </w:pPr>
+            <w:r>
+              <w:rPr>
+                <w:rFonts w:ascii="Calibri" w:cs="Calibri" w:eastAsia="Calibri" w:hAnsi="Calibri"/>
+                <w:b/>
+                <w:bCs/>
+                <w:color w:val="B0206B"/>
+                <w:sz w:val="11"/>
+                <w:szCs w:val="11"/>
+              </w:rPr>
+              <w:t xml:space="preserve">13</w:t>
+            </w:r>
+          </w:p>
+        </w:tc>
+        <w:tc>
+          <w:tcPr>
+            <w:tcW w:type="dxa" w:w="774"/>
+            <w:tcBorders>
+              <w:top w:val="none" w:color="FFFFFF" w:sz="0"/>
+              <w:left w:val="none" w:color="FFFFFF" w:sz="0"/>
+              <w:bottom w:val="none" w:color="FFFFFF" w:sz="0"/>
+              <w:right w:val="none" w:color="FFFFFF" w:sz="0"/>
+            </w:tcBorders>
+            <w:tcMar>
+              <w:top w:type="dxa" w:w="30"/>
+              <w:left w:type="dxa" w:w="20"/>
+              <w:bottom w:type="dxa" w:w="30"/>
+              <w:right w:type="dxa" w:w="20"/>
+            </w:tcMar>
+          </w:tcPr>
+          <w:p>
+            <w:pPr>
+              <w:jc w:val="center"/>
+            </w:pPr>
+            <w:r>
+              <w:drawing>
+                <wp:inline distT="0" distB="0" distL="0" distR="0">
+                  <wp:extent cx="381000" cy="381000"/>
+                  <wp:effectExtent t="0" r="0" b="0" l="0"/>
+                  <wp:docPr id="1" name="" descr="" title=""/>
+                  <wp:cNvGraphicFramePr>
+                    <a:graphicFrameLocks xmlns:a="http://schemas.openxmlformats.org/drawingml/2006/main" noChangeAspect="1"/>
+                  </wp:cNvGraphicFramePr>
+                  <a:graphic xmlns:a="http://schemas.openxmlformats.org/drawingml/2006/main">
+                    <a:graphicData uri="http://schemas.openxmlformats.org/drawingml/2006/picture">
+                      <pic:pic xmlns:pic="http://schemas.openxmlformats.org/drawingml/2006/picture">
+                        <pic:nvPicPr>
+                          <pic:cNvPr id="0" name="" descr=""/>
+                          <pic:cNvPicPr>
+                            <a:picLocks noChangeAspect="1" noChangeArrowheads="1"/>
+                          </pic:cNvPicPr>
+                        </pic:nvPicPr>
+                        <pic:blipFill>
+                          <a:blip r:embed="rId20" cstate="none"/>
+                          <a:srcRect/>
+                          <a:stretch>
+                            <a:fillRect/>
+                          </a:stretch>
+                        </pic:blipFill>
+                        <pic:spPr bwMode="auto">
+                          <a:xfrm>
+                            <a:off x="0" y="0"/>
+                            <a:ext cx="381000" cy="381000"/>
+                          </a:xfrm>
+                          <a:prstGeom prst="rect">
+                            <a:avLst/>
+                          </a:prstGeom>
+                        </pic:spPr>
+                      </pic:pic>
+                    </a:graphicData>
+                  </a:graphic>
+                </wp:inline>
+              </w:drawing>
+            </w:r>
+          </w:p>
+          <w:p>
+            <w:pPr>
+              <w:spacing w:before="15"/>
+              <w:jc w:val="center"/>
+            </w:pPr>
+            <w:r>
+              <w:rPr>
+                <w:rFonts w:ascii="Calibri" w:cs="Calibri" w:eastAsia="Calibri" w:hAnsi="Calibri"/>
+                <w:b/>
+                <w:bCs/>
+                <w:color w:val="B0206B"/>
+                <w:sz w:val="11"/>
+                <w:szCs w:val="11"/>
+              </w:rPr>
+              <w:t xml:space="preserve">14</w:t>
             </w:r>
           </w:p>
         </w:tc>

</xml_diff>

<commit_message>
Add 4 new clips (18 total) and link social mentions to profiles
Mirrors the same update pushed to Alexisg324/UGC.
</commit_message>
<xml_diff>
--- a/media-kit/Alexis_UGC_Media_Kit.docx
+++ b/media-kit/Alexis_UGC_Media_Kit.docx
@@ -145,7 +145,7 @@
         <w:pBdr>
           <w:bottom w:val="single" w:color="E0338C" w:sz="8" w:space="4"/>
         </w:pBdr>
-        <w:spacing w:after="40" w:before="100"/>
+        <w:spacing w:after="30" w:before="75"/>
       </w:pPr>
       <w:r>
         <w:rPr>
@@ -179,7 +179,7 @@
         <w:pBdr>
           <w:bottom w:val="single" w:color="E0338C" w:sz="8" w:space="4"/>
         </w:pBdr>
-        <w:spacing w:after="40" w:before="100"/>
+        <w:spacing w:after="30" w:before="75"/>
       </w:pPr>
       <w:r>
         <w:rPr>
@@ -331,7 +331,7 @@
         <w:pBdr>
           <w:bottom w:val="single" w:color="E0338C" w:sz="8" w:space="4"/>
         </w:pBdr>
-        <w:spacing w:after="40" w:before="100"/>
+        <w:spacing w:after="30" w:before="75"/>
       </w:pPr>
       <w:r>
         <w:rPr>
@@ -375,25 +375,20 @@
         </w:tblBorders>
       </w:tblPr>
       <w:tblGrid>
-        <w:gridCol w:w="774"/>
-        <w:gridCol w:w="774"/>
-        <w:gridCol w:w="774"/>
-        <w:gridCol w:w="774"/>
-        <w:gridCol w:w="774"/>
-        <w:gridCol w:w="774"/>
-        <w:gridCol w:w="774"/>
-        <w:gridCol w:w="774"/>
-        <w:gridCol w:w="774"/>
-        <w:gridCol w:w="774"/>
-        <w:gridCol w:w="774"/>
-        <w:gridCol w:w="774"/>
-        <w:gridCol w:w="774"/>
-        <w:gridCol w:w="774"/>
+        <w:gridCol w:w="1204"/>
+        <w:gridCol w:w="1204"/>
+        <w:gridCol w:w="1204"/>
+        <w:gridCol w:w="1204"/>
+        <w:gridCol w:w="1204"/>
+        <w:gridCol w:w="1204"/>
+        <w:gridCol w:w="1204"/>
+        <w:gridCol w:w="1204"/>
+        <w:gridCol w:w="1204"/>
       </w:tblGrid>
       <w:tr>
         <w:tc>
           <w:tcPr>
-            <w:tcW w:type="dxa" w:w="774"/>
+            <w:tcW w:type="dxa" w:w="1204"/>
             <w:tcBorders>
               <w:top w:val="none" w:color="FFFFFF" w:sz="0"/>
               <w:left w:val="none" w:color="FFFFFF" w:sz="0"/>
@@ -401,9 +396,9 @@
               <w:right w:val="none" w:color="FFFFFF" w:sz="0"/>
             </w:tcBorders>
             <w:tcMar>
-              <w:top w:type="dxa" w:w="30"/>
+              <w:top w:type="dxa" w:w="18"/>
               <w:left w:type="dxa" w:w="20"/>
-              <w:bottom w:type="dxa" w:w="30"/>
+              <w:bottom w:type="dxa" w:w="18"/>
               <w:right w:type="dxa" w:w="20"/>
             </w:tcMar>
           </w:tcPr>
@@ -414,7 +409,7 @@
             <w:r>
               <w:drawing>
                 <wp:inline distT="0" distB="0" distL="0" distR="0">
-                  <wp:extent cx="381000" cy="381000"/>
+                  <wp:extent cx="304800" cy="304800"/>
                   <wp:effectExtent t="0" r="0" b="0" l="0"/>
                   <wp:docPr id="1" name="" descr="" title=""/>
                   <wp:cNvGraphicFramePr>
@@ -439,7 +434,7 @@
                         <pic:spPr bwMode="auto">
                           <a:xfrm>
                             <a:off x="0" y="0"/>
-                            <a:ext cx="381000" cy="381000"/>
+                            <a:ext cx="304800" cy="304800"/>
                           </a:xfrm>
                           <a:prstGeom prst="rect">
                             <a:avLst/>
@@ -454,7 +449,7 @@
           </w:p>
           <w:p>
             <w:pPr>
-              <w:spacing w:before="15"/>
+              <w:spacing w:before="10"/>
               <w:jc w:val="center"/>
             </w:pPr>
             <w:r>
@@ -463,8 +458,8 @@
                 <w:b/>
                 <w:bCs/>
                 <w:color w:val="B0206B"/>
-                <w:sz w:val="11"/>
-                <w:szCs w:val="11"/>
+                <w:sz w:val="10"/>
+                <w:szCs w:val="10"/>
               </w:rPr>
               <w:t xml:space="preserve">01</w:t>
             </w:r>
@@ -472,7 +467,7 @@
         </w:tc>
         <w:tc>
           <w:tcPr>
-            <w:tcW w:type="dxa" w:w="774"/>
+            <w:tcW w:type="dxa" w:w="1204"/>
             <w:tcBorders>
               <w:top w:val="none" w:color="FFFFFF" w:sz="0"/>
               <w:left w:val="none" w:color="FFFFFF" w:sz="0"/>
@@ -480,9 +475,9 @@
               <w:right w:val="none" w:color="FFFFFF" w:sz="0"/>
             </w:tcBorders>
             <w:tcMar>
-              <w:top w:type="dxa" w:w="30"/>
+              <w:top w:type="dxa" w:w="18"/>
               <w:left w:type="dxa" w:w="20"/>
-              <w:bottom w:type="dxa" w:w="30"/>
+              <w:bottom w:type="dxa" w:w="18"/>
               <w:right w:type="dxa" w:w="20"/>
             </w:tcMar>
           </w:tcPr>
@@ -493,7 +488,7 @@
             <w:r>
               <w:drawing>
                 <wp:inline distT="0" distB="0" distL="0" distR="0">
-                  <wp:extent cx="381000" cy="381000"/>
+                  <wp:extent cx="304800" cy="304800"/>
                   <wp:effectExtent t="0" r="0" b="0" l="0"/>
                   <wp:docPr id="1" name="" descr="" title=""/>
                   <wp:cNvGraphicFramePr>
@@ -518,7 +513,7 @@
                         <pic:spPr bwMode="auto">
                           <a:xfrm>
                             <a:off x="0" y="0"/>
-                            <a:ext cx="381000" cy="381000"/>
+                            <a:ext cx="304800" cy="304800"/>
                           </a:xfrm>
                           <a:prstGeom prst="rect">
                             <a:avLst/>
@@ -533,7 +528,7 @@
           </w:p>
           <w:p>
             <w:pPr>
-              <w:spacing w:before="15"/>
+              <w:spacing w:before="10"/>
               <w:jc w:val="center"/>
             </w:pPr>
             <w:r>
@@ -542,8 +537,8 @@
                 <w:b/>
                 <w:bCs/>
                 <w:color w:val="B0206B"/>
-                <w:sz w:val="11"/>
-                <w:szCs w:val="11"/>
+                <w:sz w:val="10"/>
+                <w:szCs w:val="10"/>
               </w:rPr>
               <w:t xml:space="preserve">02</w:t>
             </w:r>
@@ -551,7 +546,7 @@
         </w:tc>
         <w:tc>
           <w:tcPr>
-            <w:tcW w:type="dxa" w:w="774"/>
+            <w:tcW w:type="dxa" w:w="1204"/>
             <w:tcBorders>
               <w:top w:val="none" w:color="FFFFFF" w:sz="0"/>
               <w:left w:val="none" w:color="FFFFFF" w:sz="0"/>
@@ -559,9 +554,9 @@
               <w:right w:val="none" w:color="FFFFFF" w:sz="0"/>
             </w:tcBorders>
             <w:tcMar>
-              <w:top w:type="dxa" w:w="30"/>
+              <w:top w:type="dxa" w:w="18"/>
               <w:left w:type="dxa" w:w="20"/>
-              <w:bottom w:type="dxa" w:w="30"/>
+              <w:bottom w:type="dxa" w:w="18"/>
               <w:right w:type="dxa" w:w="20"/>
             </w:tcMar>
           </w:tcPr>
@@ -572,7 +567,7 @@
             <w:r>
               <w:drawing>
                 <wp:inline distT="0" distB="0" distL="0" distR="0">
-                  <wp:extent cx="381000" cy="381000"/>
+                  <wp:extent cx="304800" cy="304800"/>
                   <wp:effectExtent t="0" r="0" b="0" l="0"/>
                   <wp:docPr id="1" name="" descr="" title=""/>
                   <wp:cNvGraphicFramePr>
@@ -597,7 +592,7 @@
                         <pic:spPr bwMode="auto">
                           <a:xfrm>
                             <a:off x="0" y="0"/>
-                            <a:ext cx="381000" cy="381000"/>
+                            <a:ext cx="304800" cy="304800"/>
                           </a:xfrm>
                           <a:prstGeom prst="rect">
                             <a:avLst/>
@@ -612,7 +607,7 @@
           </w:p>
           <w:p>
             <w:pPr>
-              <w:spacing w:before="15"/>
+              <w:spacing w:before="10"/>
               <w:jc w:val="center"/>
             </w:pPr>
             <w:r>
@@ -621,8 +616,8 @@
                 <w:b/>
                 <w:bCs/>
                 <w:color w:val="B0206B"/>
-                <w:sz w:val="11"/>
-                <w:szCs w:val="11"/>
+                <w:sz w:val="10"/>
+                <w:szCs w:val="10"/>
               </w:rPr>
               <w:t xml:space="preserve">03</w:t>
             </w:r>
@@ -630,7 +625,7 @@
         </w:tc>
         <w:tc>
           <w:tcPr>
-            <w:tcW w:type="dxa" w:w="774"/>
+            <w:tcW w:type="dxa" w:w="1204"/>
             <w:tcBorders>
               <w:top w:val="none" w:color="FFFFFF" w:sz="0"/>
               <w:left w:val="none" w:color="FFFFFF" w:sz="0"/>
@@ -638,9 +633,9 @@
               <w:right w:val="none" w:color="FFFFFF" w:sz="0"/>
             </w:tcBorders>
             <w:tcMar>
-              <w:top w:type="dxa" w:w="30"/>
+              <w:top w:type="dxa" w:w="18"/>
               <w:left w:type="dxa" w:w="20"/>
-              <w:bottom w:type="dxa" w:w="30"/>
+              <w:bottom w:type="dxa" w:w="18"/>
               <w:right w:type="dxa" w:w="20"/>
             </w:tcMar>
           </w:tcPr>
@@ -651,7 +646,7 @@
             <w:r>
               <w:drawing>
                 <wp:inline distT="0" distB="0" distL="0" distR="0">
-                  <wp:extent cx="381000" cy="381000"/>
+                  <wp:extent cx="304800" cy="304800"/>
                   <wp:effectExtent t="0" r="0" b="0" l="0"/>
                   <wp:docPr id="1" name="" descr="" title=""/>
                   <wp:cNvGraphicFramePr>
@@ -676,7 +671,7 @@
                         <pic:spPr bwMode="auto">
                           <a:xfrm>
                             <a:off x="0" y="0"/>
-                            <a:ext cx="381000" cy="381000"/>
+                            <a:ext cx="304800" cy="304800"/>
                           </a:xfrm>
                           <a:prstGeom prst="rect">
                             <a:avLst/>
@@ -691,7 +686,7 @@
           </w:p>
           <w:p>
             <w:pPr>
-              <w:spacing w:before="15"/>
+              <w:spacing w:before="10"/>
               <w:jc w:val="center"/>
             </w:pPr>
             <w:r>
@@ -700,8 +695,8 @@
                 <w:b/>
                 <w:bCs/>
                 <w:color w:val="B0206B"/>
-                <w:sz w:val="11"/>
-                <w:szCs w:val="11"/>
+                <w:sz w:val="10"/>
+                <w:szCs w:val="10"/>
               </w:rPr>
               <w:t xml:space="preserve">04</w:t>
             </w:r>
@@ -709,7 +704,7 @@
         </w:tc>
         <w:tc>
           <w:tcPr>
-            <w:tcW w:type="dxa" w:w="774"/>
+            <w:tcW w:type="dxa" w:w="1204"/>
             <w:tcBorders>
               <w:top w:val="none" w:color="FFFFFF" w:sz="0"/>
               <w:left w:val="none" w:color="FFFFFF" w:sz="0"/>
@@ -717,9 +712,9 @@
               <w:right w:val="none" w:color="FFFFFF" w:sz="0"/>
             </w:tcBorders>
             <w:tcMar>
-              <w:top w:type="dxa" w:w="30"/>
+              <w:top w:type="dxa" w:w="18"/>
               <w:left w:type="dxa" w:w="20"/>
-              <w:bottom w:type="dxa" w:w="30"/>
+              <w:bottom w:type="dxa" w:w="18"/>
               <w:right w:type="dxa" w:w="20"/>
             </w:tcMar>
           </w:tcPr>
@@ -730,7 +725,7 @@
             <w:r>
               <w:drawing>
                 <wp:inline distT="0" distB="0" distL="0" distR="0">
-                  <wp:extent cx="381000" cy="381000"/>
+                  <wp:extent cx="304800" cy="304800"/>
                   <wp:effectExtent t="0" r="0" b="0" l="0"/>
                   <wp:docPr id="1" name="" descr="" title=""/>
                   <wp:cNvGraphicFramePr>
@@ -755,7 +750,7 @@
                         <pic:spPr bwMode="auto">
                           <a:xfrm>
                             <a:off x="0" y="0"/>
-                            <a:ext cx="381000" cy="381000"/>
+                            <a:ext cx="304800" cy="304800"/>
                           </a:xfrm>
                           <a:prstGeom prst="rect">
                             <a:avLst/>
@@ -770,7 +765,7 @@
           </w:p>
           <w:p>
             <w:pPr>
-              <w:spacing w:before="15"/>
+              <w:spacing w:before="10"/>
               <w:jc w:val="center"/>
             </w:pPr>
             <w:r>
@@ -779,8 +774,8 @@
                 <w:b/>
                 <w:bCs/>
                 <w:color w:val="B0206B"/>
-                <w:sz w:val="11"/>
-                <w:szCs w:val="11"/>
+                <w:sz w:val="10"/>
+                <w:szCs w:val="10"/>
               </w:rPr>
               <w:t xml:space="preserve">05</w:t>
             </w:r>
@@ -788,7 +783,7 @@
         </w:tc>
         <w:tc>
           <w:tcPr>
-            <w:tcW w:type="dxa" w:w="774"/>
+            <w:tcW w:type="dxa" w:w="1204"/>
             <w:tcBorders>
               <w:top w:val="none" w:color="FFFFFF" w:sz="0"/>
               <w:left w:val="none" w:color="FFFFFF" w:sz="0"/>
@@ -796,9 +791,9 @@
               <w:right w:val="none" w:color="FFFFFF" w:sz="0"/>
             </w:tcBorders>
             <w:tcMar>
-              <w:top w:type="dxa" w:w="30"/>
+              <w:top w:type="dxa" w:w="18"/>
               <w:left w:type="dxa" w:w="20"/>
-              <w:bottom w:type="dxa" w:w="30"/>
+              <w:bottom w:type="dxa" w:w="18"/>
               <w:right w:type="dxa" w:w="20"/>
             </w:tcMar>
           </w:tcPr>
@@ -809,7 +804,7 @@
             <w:r>
               <w:drawing>
                 <wp:inline distT="0" distB="0" distL="0" distR="0">
-                  <wp:extent cx="381000" cy="381000"/>
+                  <wp:extent cx="304800" cy="304800"/>
                   <wp:effectExtent t="0" r="0" b="0" l="0"/>
                   <wp:docPr id="1" name="" descr="" title=""/>
                   <wp:cNvGraphicFramePr>
@@ -834,7 +829,7 @@
                         <pic:spPr bwMode="auto">
                           <a:xfrm>
                             <a:off x="0" y="0"/>
-                            <a:ext cx="381000" cy="381000"/>
+                            <a:ext cx="304800" cy="304800"/>
                           </a:xfrm>
                           <a:prstGeom prst="rect">
                             <a:avLst/>
@@ -849,7 +844,7 @@
           </w:p>
           <w:p>
             <w:pPr>
-              <w:spacing w:before="15"/>
+              <w:spacing w:before="10"/>
               <w:jc w:val="center"/>
             </w:pPr>
             <w:r>
@@ -858,8 +853,8 @@
                 <w:b/>
                 <w:bCs/>
                 <w:color w:val="B0206B"/>
-                <w:sz w:val="11"/>
-                <w:szCs w:val="11"/>
+                <w:sz w:val="10"/>
+                <w:szCs w:val="10"/>
               </w:rPr>
               <w:t xml:space="preserve">06</w:t>
             </w:r>
@@ -867,7 +862,7 @@
         </w:tc>
         <w:tc>
           <w:tcPr>
-            <w:tcW w:type="dxa" w:w="774"/>
+            <w:tcW w:type="dxa" w:w="1204"/>
             <w:tcBorders>
               <w:top w:val="none" w:color="FFFFFF" w:sz="0"/>
               <w:left w:val="none" w:color="FFFFFF" w:sz="0"/>
@@ -875,9 +870,9 @@
               <w:right w:val="none" w:color="FFFFFF" w:sz="0"/>
             </w:tcBorders>
             <w:tcMar>
-              <w:top w:type="dxa" w:w="30"/>
+              <w:top w:type="dxa" w:w="18"/>
               <w:left w:type="dxa" w:w="20"/>
-              <w:bottom w:type="dxa" w:w="30"/>
+              <w:bottom w:type="dxa" w:w="18"/>
               <w:right w:type="dxa" w:w="20"/>
             </w:tcMar>
           </w:tcPr>
@@ -888,7 +883,7 @@
             <w:r>
               <w:drawing>
                 <wp:inline distT="0" distB="0" distL="0" distR="0">
-                  <wp:extent cx="381000" cy="381000"/>
+                  <wp:extent cx="304800" cy="304800"/>
                   <wp:effectExtent t="0" r="0" b="0" l="0"/>
                   <wp:docPr id="1" name="" descr="" title=""/>
                   <wp:cNvGraphicFramePr>
@@ -913,7 +908,7 @@
                         <pic:spPr bwMode="auto">
                           <a:xfrm>
                             <a:off x="0" y="0"/>
-                            <a:ext cx="381000" cy="381000"/>
+                            <a:ext cx="304800" cy="304800"/>
                           </a:xfrm>
                           <a:prstGeom prst="rect">
                             <a:avLst/>
@@ -928,7 +923,7 @@
           </w:p>
           <w:p>
             <w:pPr>
-              <w:spacing w:before="15"/>
+              <w:spacing w:before="10"/>
               <w:jc w:val="center"/>
             </w:pPr>
             <w:r>
@@ -937,8 +932,8 @@
                 <w:b/>
                 <w:bCs/>
                 <w:color w:val="B0206B"/>
-                <w:sz w:val="11"/>
-                <w:szCs w:val="11"/>
+                <w:sz w:val="10"/>
+                <w:szCs w:val="10"/>
               </w:rPr>
               <w:t xml:space="preserve">07</w:t>
             </w:r>
@@ -946,7 +941,7 @@
         </w:tc>
         <w:tc>
           <w:tcPr>
-            <w:tcW w:type="dxa" w:w="774"/>
+            <w:tcW w:type="dxa" w:w="1204"/>
             <w:tcBorders>
               <w:top w:val="none" w:color="FFFFFF" w:sz="0"/>
               <w:left w:val="none" w:color="FFFFFF" w:sz="0"/>
@@ -954,9 +949,9 @@
               <w:right w:val="none" w:color="FFFFFF" w:sz="0"/>
             </w:tcBorders>
             <w:tcMar>
-              <w:top w:type="dxa" w:w="30"/>
+              <w:top w:type="dxa" w:w="18"/>
               <w:left w:type="dxa" w:w="20"/>
-              <w:bottom w:type="dxa" w:w="30"/>
+              <w:bottom w:type="dxa" w:w="18"/>
               <w:right w:type="dxa" w:w="20"/>
             </w:tcMar>
           </w:tcPr>
@@ -967,7 +962,7 @@
             <w:r>
               <w:drawing>
                 <wp:inline distT="0" distB="0" distL="0" distR="0">
-                  <wp:extent cx="381000" cy="381000"/>
+                  <wp:extent cx="304800" cy="304800"/>
                   <wp:effectExtent t="0" r="0" b="0" l="0"/>
                   <wp:docPr id="1" name="" descr="" title=""/>
                   <wp:cNvGraphicFramePr>
@@ -992,7 +987,7 @@
                         <pic:spPr bwMode="auto">
                           <a:xfrm>
                             <a:off x="0" y="0"/>
-                            <a:ext cx="381000" cy="381000"/>
+                            <a:ext cx="304800" cy="304800"/>
                           </a:xfrm>
                           <a:prstGeom prst="rect">
                             <a:avLst/>
@@ -1007,7 +1002,7 @@
           </w:p>
           <w:p>
             <w:pPr>
-              <w:spacing w:before="15"/>
+              <w:spacing w:before="10"/>
               <w:jc w:val="center"/>
             </w:pPr>
             <w:r>
@@ -1016,8 +1011,8 @@
                 <w:b/>
                 <w:bCs/>
                 <w:color w:val="B0206B"/>
-                <w:sz w:val="11"/>
-                <w:szCs w:val="11"/>
+                <w:sz w:val="10"/>
+                <w:szCs w:val="10"/>
               </w:rPr>
               <w:t xml:space="preserve">08</w:t>
             </w:r>
@@ -1025,7 +1020,7 @@
         </w:tc>
         <w:tc>
           <w:tcPr>
-            <w:tcW w:type="dxa" w:w="774"/>
+            <w:tcW w:type="dxa" w:w="1204"/>
             <w:tcBorders>
               <w:top w:val="none" w:color="FFFFFF" w:sz="0"/>
               <w:left w:val="none" w:color="FFFFFF" w:sz="0"/>
@@ -1033,9 +1028,9 @@
               <w:right w:val="none" w:color="FFFFFF" w:sz="0"/>
             </w:tcBorders>
             <w:tcMar>
-              <w:top w:type="dxa" w:w="30"/>
+              <w:top w:type="dxa" w:w="18"/>
               <w:left w:type="dxa" w:w="20"/>
-              <w:bottom w:type="dxa" w:w="30"/>
+              <w:bottom w:type="dxa" w:w="18"/>
               <w:right w:type="dxa" w:w="20"/>
             </w:tcMar>
           </w:tcPr>
@@ -1046,7 +1041,7 @@
             <w:r>
               <w:drawing>
                 <wp:inline distT="0" distB="0" distL="0" distR="0">
-                  <wp:extent cx="381000" cy="381000"/>
+                  <wp:extent cx="304800" cy="304800"/>
                   <wp:effectExtent t="0" r="0" b="0" l="0"/>
                   <wp:docPr id="1" name="" descr="" title=""/>
                   <wp:cNvGraphicFramePr>
@@ -1071,7 +1066,7 @@
                         <pic:spPr bwMode="auto">
                           <a:xfrm>
                             <a:off x="0" y="0"/>
-                            <a:ext cx="381000" cy="381000"/>
+                            <a:ext cx="304800" cy="304800"/>
                           </a:xfrm>
                           <a:prstGeom prst="rect">
                             <a:avLst/>
@@ -1086,7 +1081,7 @@
           </w:p>
           <w:p>
             <w:pPr>
-              <w:spacing w:before="15"/>
+              <w:spacing w:before="10"/>
               <w:jc w:val="center"/>
             </w:pPr>
             <w:r>
@@ -1095,16 +1090,18 @@
                 <w:b/>
                 <w:bCs/>
                 <w:color w:val="B0206B"/>
-                <w:sz w:val="11"/>
-                <w:szCs w:val="11"/>
+                <w:sz w:val="10"/>
+                <w:szCs w:val="10"/>
               </w:rPr>
               <w:t xml:space="preserve">09</w:t>
             </w:r>
           </w:p>
         </w:tc>
-        <w:tc>
-          <w:tcPr>
-            <w:tcW w:type="dxa" w:w="774"/>
+      </w:tr>
+      <w:tr>
+        <w:tc>
+          <w:tcPr>
+            <w:tcW w:type="dxa" w:w="1204"/>
             <w:tcBorders>
               <w:top w:val="none" w:color="FFFFFF" w:sz="0"/>
               <w:left w:val="none" w:color="FFFFFF" w:sz="0"/>
@@ -1112,9 +1109,9 @@
               <w:right w:val="none" w:color="FFFFFF" w:sz="0"/>
             </w:tcBorders>
             <w:tcMar>
-              <w:top w:type="dxa" w:w="30"/>
+              <w:top w:type="dxa" w:w="18"/>
               <w:left w:type="dxa" w:w="20"/>
-              <w:bottom w:type="dxa" w:w="30"/>
+              <w:bottom w:type="dxa" w:w="18"/>
               <w:right w:type="dxa" w:w="20"/>
             </w:tcMar>
           </w:tcPr>
@@ -1125,7 +1122,7 @@
             <w:r>
               <w:drawing>
                 <wp:inline distT="0" distB="0" distL="0" distR="0">
-                  <wp:extent cx="381000" cy="381000"/>
+                  <wp:extent cx="304800" cy="304800"/>
                   <wp:effectExtent t="0" r="0" b="0" l="0"/>
                   <wp:docPr id="1" name="" descr="" title=""/>
                   <wp:cNvGraphicFramePr>
@@ -1150,7 +1147,7 @@
                         <pic:spPr bwMode="auto">
                           <a:xfrm>
                             <a:off x="0" y="0"/>
-                            <a:ext cx="381000" cy="381000"/>
+                            <a:ext cx="304800" cy="304800"/>
                           </a:xfrm>
                           <a:prstGeom prst="rect">
                             <a:avLst/>
@@ -1165,7 +1162,7 @@
           </w:p>
           <w:p>
             <w:pPr>
-              <w:spacing w:before="15"/>
+              <w:spacing w:before="10"/>
               <w:jc w:val="center"/>
             </w:pPr>
             <w:r>
@@ -1174,8 +1171,8 @@
                 <w:b/>
                 <w:bCs/>
                 <w:color w:val="B0206B"/>
-                <w:sz w:val="11"/>
-                <w:szCs w:val="11"/>
+                <w:sz w:val="10"/>
+                <w:szCs w:val="10"/>
               </w:rPr>
               <w:t xml:space="preserve">10</w:t>
             </w:r>
@@ -1183,7 +1180,7 @@
         </w:tc>
         <w:tc>
           <w:tcPr>
-            <w:tcW w:type="dxa" w:w="774"/>
+            <w:tcW w:type="dxa" w:w="1204"/>
             <w:tcBorders>
               <w:top w:val="none" w:color="FFFFFF" w:sz="0"/>
               <w:left w:val="none" w:color="FFFFFF" w:sz="0"/>
@@ -1191,9 +1188,9 @@
               <w:right w:val="none" w:color="FFFFFF" w:sz="0"/>
             </w:tcBorders>
             <w:tcMar>
-              <w:top w:type="dxa" w:w="30"/>
+              <w:top w:type="dxa" w:w="18"/>
               <w:left w:type="dxa" w:w="20"/>
-              <w:bottom w:type="dxa" w:w="30"/>
+              <w:bottom w:type="dxa" w:w="18"/>
               <w:right w:type="dxa" w:w="20"/>
             </w:tcMar>
           </w:tcPr>
@@ -1204,7 +1201,7 @@
             <w:r>
               <w:drawing>
                 <wp:inline distT="0" distB="0" distL="0" distR="0">
-                  <wp:extent cx="381000" cy="381000"/>
+                  <wp:extent cx="304800" cy="304800"/>
                   <wp:effectExtent t="0" r="0" b="0" l="0"/>
                   <wp:docPr id="1" name="" descr="" title=""/>
                   <wp:cNvGraphicFramePr>
@@ -1229,7 +1226,7 @@
                         <pic:spPr bwMode="auto">
                           <a:xfrm>
                             <a:off x="0" y="0"/>
-                            <a:ext cx="381000" cy="381000"/>
+                            <a:ext cx="304800" cy="304800"/>
                           </a:xfrm>
                           <a:prstGeom prst="rect">
                             <a:avLst/>
@@ -1244,7 +1241,7 @@
           </w:p>
           <w:p>
             <w:pPr>
-              <w:spacing w:before="15"/>
+              <w:spacing w:before="10"/>
               <w:jc w:val="center"/>
             </w:pPr>
             <w:r>
@@ -1253,8 +1250,8 @@
                 <w:b/>
                 <w:bCs/>
                 <w:color w:val="B0206B"/>
-                <w:sz w:val="11"/>
-                <w:szCs w:val="11"/>
+                <w:sz w:val="10"/>
+                <w:szCs w:val="10"/>
               </w:rPr>
               <w:t xml:space="preserve">11</w:t>
             </w:r>
@@ -1262,7 +1259,7 @@
         </w:tc>
         <w:tc>
           <w:tcPr>
-            <w:tcW w:type="dxa" w:w="774"/>
+            <w:tcW w:type="dxa" w:w="1204"/>
             <w:tcBorders>
               <w:top w:val="none" w:color="FFFFFF" w:sz="0"/>
               <w:left w:val="none" w:color="FFFFFF" w:sz="0"/>
@@ -1270,9 +1267,9 @@
               <w:right w:val="none" w:color="FFFFFF" w:sz="0"/>
             </w:tcBorders>
             <w:tcMar>
-              <w:top w:type="dxa" w:w="30"/>
+              <w:top w:type="dxa" w:w="18"/>
               <w:left w:type="dxa" w:w="20"/>
-              <w:bottom w:type="dxa" w:w="30"/>
+              <w:bottom w:type="dxa" w:w="18"/>
               <w:right w:type="dxa" w:w="20"/>
             </w:tcMar>
           </w:tcPr>
@@ -1283,7 +1280,7 @@
             <w:r>
               <w:drawing>
                 <wp:inline distT="0" distB="0" distL="0" distR="0">
-                  <wp:extent cx="381000" cy="381000"/>
+                  <wp:extent cx="304800" cy="304800"/>
                   <wp:effectExtent t="0" r="0" b="0" l="0"/>
                   <wp:docPr id="1" name="" descr="" title=""/>
                   <wp:cNvGraphicFramePr>
@@ -1308,7 +1305,7 @@
                         <pic:spPr bwMode="auto">
                           <a:xfrm>
                             <a:off x="0" y="0"/>
-                            <a:ext cx="381000" cy="381000"/>
+                            <a:ext cx="304800" cy="304800"/>
                           </a:xfrm>
                           <a:prstGeom prst="rect">
                             <a:avLst/>
@@ -1323,7 +1320,7 @@
           </w:p>
           <w:p>
             <w:pPr>
-              <w:spacing w:before="15"/>
+              <w:spacing w:before="10"/>
               <w:jc w:val="center"/>
             </w:pPr>
             <w:r>
@@ -1332,8 +1329,8 @@
                 <w:b/>
                 <w:bCs/>
                 <w:color w:val="B0206B"/>
-                <w:sz w:val="11"/>
-                <w:szCs w:val="11"/>
+                <w:sz w:val="10"/>
+                <w:szCs w:val="10"/>
               </w:rPr>
               <w:t xml:space="preserve">12</w:t>
             </w:r>
@@ -1341,7 +1338,7 @@
         </w:tc>
         <w:tc>
           <w:tcPr>
-            <w:tcW w:type="dxa" w:w="774"/>
+            <w:tcW w:type="dxa" w:w="1204"/>
             <w:tcBorders>
               <w:top w:val="none" w:color="FFFFFF" w:sz="0"/>
               <w:left w:val="none" w:color="FFFFFF" w:sz="0"/>
@@ -1349,9 +1346,9 @@
               <w:right w:val="none" w:color="FFFFFF" w:sz="0"/>
             </w:tcBorders>
             <w:tcMar>
-              <w:top w:type="dxa" w:w="30"/>
+              <w:top w:type="dxa" w:w="18"/>
               <w:left w:type="dxa" w:w="20"/>
-              <w:bottom w:type="dxa" w:w="30"/>
+              <w:bottom w:type="dxa" w:w="18"/>
               <w:right w:type="dxa" w:w="20"/>
             </w:tcMar>
           </w:tcPr>
@@ -1362,7 +1359,7 @@
             <w:r>
               <w:drawing>
                 <wp:inline distT="0" distB="0" distL="0" distR="0">
-                  <wp:extent cx="381000" cy="381000"/>
+                  <wp:extent cx="304800" cy="304800"/>
                   <wp:effectExtent t="0" r="0" b="0" l="0"/>
                   <wp:docPr id="1" name="" descr="" title=""/>
                   <wp:cNvGraphicFramePr>
@@ -1387,7 +1384,7 @@
                         <pic:spPr bwMode="auto">
                           <a:xfrm>
                             <a:off x="0" y="0"/>
-                            <a:ext cx="381000" cy="381000"/>
+                            <a:ext cx="304800" cy="304800"/>
                           </a:xfrm>
                           <a:prstGeom prst="rect">
                             <a:avLst/>
@@ -1402,7 +1399,7 @@
           </w:p>
           <w:p>
             <w:pPr>
-              <w:spacing w:before="15"/>
+              <w:spacing w:before="10"/>
               <w:jc w:val="center"/>
             </w:pPr>
             <w:r>
@@ -1411,8 +1408,8 @@
                 <w:b/>
                 <w:bCs/>
                 <w:color w:val="B0206B"/>
-                <w:sz w:val="11"/>
-                <w:szCs w:val="11"/>
+                <w:sz w:val="10"/>
+                <w:szCs w:val="10"/>
               </w:rPr>
               <w:t xml:space="preserve">13</w:t>
             </w:r>
@@ -1420,7 +1417,7 @@
         </w:tc>
         <w:tc>
           <w:tcPr>
-            <w:tcW w:type="dxa" w:w="774"/>
+            <w:tcW w:type="dxa" w:w="1204"/>
             <w:tcBorders>
               <w:top w:val="none" w:color="FFFFFF" w:sz="0"/>
               <w:left w:val="none" w:color="FFFFFF" w:sz="0"/>
@@ -1428,9 +1425,9 @@
               <w:right w:val="none" w:color="FFFFFF" w:sz="0"/>
             </w:tcBorders>
             <w:tcMar>
-              <w:top w:type="dxa" w:w="30"/>
+              <w:top w:type="dxa" w:w="18"/>
               <w:left w:type="dxa" w:w="20"/>
-              <w:bottom w:type="dxa" w:w="30"/>
+              <w:bottom w:type="dxa" w:w="18"/>
               <w:right w:type="dxa" w:w="20"/>
             </w:tcMar>
           </w:tcPr>
@@ -1441,7 +1438,7 @@
             <w:r>
               <w:drawing>
                 <wp:inline distT="0" distB="0" distL="0" distR="0">
-                  <wp:extent cx="381000" cy="381000"/>
+                  <wp:extent cx="304800" cy="304800"/>
                   <wp:effectExtent t="0" r="0" b="0" l="0"/>
                   <wp:docPr id="1" name="" descr="" title=""/>
                   <wp:cNvGraphicFramePr>
@@ -1466,7 +1463,7 @@
                         <pic:spPr bwMode="auto">
                           <a:xfrm>
                             <a:off x="0" y="0"/>
-                            <a:ext cx="381000" cy="381000"/>
+                            <a:ext cx="304800" cy="304800"/>
                           </a:xfrm>
                           <a:prstGeom prst="rect">
                             <a:avLst/>
@@ -1481,7 +1478,7 @@
           </w:p>
           <w:p>
             <w:pPr>
-              <w:spacing w:before="15"/>
+              <w:spacing w:before="10"/>
               <w:jc w:val="center"/>
             </w:pPr>
             <w:r>
@@ -1490,10 +1487,326 @@
                 <w:b/>
                 <w:bCs/>
                 <w:color w:val="B0206B"/>
-                <w:sz w:val="11"/>
-                <w:szCs w:val="11"/>
+                <w:sz w:val="10"/>
+                <w:szCs w:val="10"/>
               </w:rPr>
               <w:t xml:space="preserve">14</w:t>
+            </w:r>
+          </w:p>
+        </w:tc>
+        <w:tc>
+          <w:tcPr>
+            <w:tcW w:type="dxa" w:w="1204"/>
+            <w:tcBorders>
+              <w:top w:val="none" w:color="FFFFFF" w:sz="0"/>
+              <w:left w:val="none" w:color="FFFFFF" w:sz="0"/>
+              <w:bottom w:val="none" w:color="FFFFFF" w:sz="0"/>
+              <w:right w:val="none" w:color="FFFFFF" w:sz="0"/>
+            </w:tcBorders>
+            <w:tcMar>
+              <w:top w:type="dxa" w:w="18"/>
+              <w:left w:type="dxa" w:w="20"/>
+              <w:bottom w:type="dxa" w:w="18"/>
+              <w:right w:type="dxa" w:w="20"/>
+            </w:tcMar>
+          </w:tcPr>
+          <w:p>
+            <w:pPr>
+              <w:jc w:val="center"/>
+            </w:pPr>
+            <w:r>
+              <w:drawing>
+                <wp:inline distT="0" distB="0" distL="0" distR="0">
+                  <wp:extent cx="304800" cy="304800"/>
+                  <wp:effectExtent t="0" r="0" b="0" l="0"/>
+                  <wp:docPr id="1" name="" descr="" title=""/>
+                  <wp:cNvGraphicFramePr>
+                    <a:graphicFrameLocks xmlns:a="http://schemas.openxmlformats.org/drawingml/2006/main" noChangeAspect="1"/>
+                  </wp:cNvGraphicFramePr>
+                  <a:graphic xmlns:a="http://schemas.openxmlformats.org/drawingml/2006/main">
+                    <a:graphicData uri="http://schemas.openxmlformats.org/drawingml/2006/picture">
+                      <pic:pic xmlns:pic="http://schemas.openxmlformats.org/drawingml/2006/picture">
+                        <pic:nvPicPr>
+                          <pic:cNvPr id="0" name="" descr=""/>
+                          <pic:cNvPicPr>
+                            <a:picLocks noChangeAspect="1" noChangeArrowheads="1"/>
+                          </pic:cNvPicPr>
+                        </pic:nvPicPr>
+                        <pic:blipFill>
+                          <a:blip r:embed="rId21" cstate="none"/>
+                          <a:srcRect/>
+                          <a:stretch>
+                            <a:fillRect/>
+                          </a:stretch>
+                        </pic:blipFill>
+                        <pic:spPr bwMode="auto">
+                          <a:xfrm>
+                            <a:off x="0" y="0"/>
+                            <a:ext cx="304800" cy="304800"/>
+                          </a:xfrm>
+                          <a:prstGeom prst="rect">
+                            <a:avLst/>
+                          </a:prstGeom>
+                        </pic:spPr>
+                      </pic:pic>
+                    </a:graphicData>
+                  </a:graphic>
+                </wp:inline>
+              </w:drawing>
+            </w:r>
+          </w:p>
+          <w:p>
+            <w:pPr>
+              <w:spacing w:before="10"/>
+              <w:jc w:val="center"/>
+            </w:pPr>
+            <w:r>
+              <w:rPr>
+                <w:rFonts w:ascii="Calibri" w:cs="Calibri" w:eastAsia="Calibri" w:hAnsi="Calibri"/>
+                <w:b/>
+                <w:bCs/>
+                <w:color w:val="B0206B"/>
+                <w:sz w:val="10"/>
+                <w:szCs w:val="10"/>
+              </w:rPr>
+              <w:t xml:space="preserve">15</w:t>
+            </w:r>
+          </w:p>
+        </w:tc>
+        <w:tc>
+          <w:tcPr>
+            <w:tcW w:type="dxa" w:w="1204"/>
+            <w:tcBorders>
+              <w:top w:val="none" w:color="FFFFFF" w:sz="0"/>
+              <w:left w:val="none" w:color="FFFFFF" w:sz="0"/>
+              <w:bottom w:val="none" w:color="FFFFFF" w:sz="0"/>
+              <w:right w:val="none" w:color="FFFFFF" w:sz="0"/>
+            </w:tcBorders>
+            <w:tcMar>
+              <w:top w:type="dxa" w:w="18"/>
+              <w:left w:type="dxa" w:w="20"/>
+              <w:bottom w:type="dxa" w:w="18"/>
+              <w:right w:type="dxa" w:w="20"/>
+            </w:tcMar>
+          </w:tcPr>
+          <w:p>
+            <w:pPr>
+              <w:jc w:val="center"/>
+            </w:pPr>
+            <w:r>
+              <w:drawing>
+                <wp:inline distT="0" distB="0" distL="0" distR="0">
+                  <wp:extent cx="304800" cy="304800"/>
+                  <wp:effectExtent t="0" r="0" b="0" l="0"/>
+                  <wp:docPr id="1" name="" descr="" title=""/>
+                  <wp:cNvGraphicFramePr>
+                    <a:graphicFrameLocks xmlns:a="http://schemas.openxmlformats.org/drawingml/2006/main" noChangeAspect="1"/>
+                  </wp:cNvGraphicFramePr>
+                  <a:graphic xmlns:a="http://schemas.openxmlformats.org/drawingml/2006/main">
+                    <a:graphicData uri="http://schemas.openxmlformats.org/drawingml/2006/picture">
+                      <pic:pic xmlns:pic="http://schemas.openxmlformats.org/drawingml/2006/picture">
+                        <pic:nvPicPr>
+                          <pic:cNvPr id="0" name="" descr=""/>
+                          <pic:cNvPicPr>
+                            <a:picLocks noChangeAspect="1" noChangeArrowheads="1"/>
+                          </pic:cNvPicPr>
+                        </pic:nvPicPr>
+                        <pic:blipFill>
+                          <a:blip r:embed="rId22" cstate="none"/>
+                          <a:srcRect/>
+                          <a:stretch>
+                            <a:fillRect/>
+                          </a:stretch>
+                        </pic:blipFill>
+                        <pic:spPr bwMode="auto">
+                          <a:xfrm>
+                            <a:off x="0" y="0"/>
+                            <a:ext cx="304800" cy="304800"/>
+                          </a:xfrm>
+                          <a:prstGeom prst="rect">
+                            <a:avLst/>
+                          </a:prstGeom>
+                        </pic:spPr>
+                      </pic:pic>
+                    </a:graphicData>
+                  </a:graphic>
+                </wp:inline>
+              </w:drawing>
+            </w:r>
+          </w:p>
+          <w:p>
+            <w:pPr>
+              <w:spacing w:before="10"/>
+              <w:jc w:val="center"/>
+            </w:pPr>
+            <w:r>
+              <w:rPr>
+                <w:rFonts w:ascii="Calibri" w:cs="Calibri" w:eastAsia="Calibri" w:hAnsi="Calibri"/>
+                <w:b/>
+                <w:bCs/>
+                <w:color w:val="B0206B"/>
+                <w:sz w:val="10"/>
+                <w:szCs w:val="10"/>
+              </w:rPr>
+              <w:t xml:space="preserve">16</w:t>
+            </w:r>
+          </w:p>
+        </w:tc>
+        <w:tc>
+          <w:tcPr>
+            <w:tcW w:type="dxa" w:w="1204"/>
+            <w:tcBorders>
+              <w:top w:val="none" w:color="FFFFFF" w:sz="0"/>
+              <w:left w:val="none" w:color="FFFFFF" w:sz="0"/>
+              <w:bottom w:val="none" w:color="FFFFFF" w:sz="0"/>
+              <w:right w:val="none" w:color="FFFFFF" w:sz="0"/>
+            </w:tcBorders>
+            <w:tcMar>
+              <w:top w:type="dxa" w:w="18"/>
+              <w:left w:type="dxa" w:w="20"/>
+              <w:bottom w:type="dxa" w:w="18"/>
+              <w:right w:type="dxa" w:w="20"/>
+            </w:tcMar>
+          </w:tcPr>
+          <w:p>
+            <w:pPr>
+              <w:jc w:val="center"/>
+            </w:pPr>
+            <w:r>
+              <w:drawing>
+                <wp:inline distT="0" distB="0" distL="0" distR="0">
+                  <wp:extent cx="304800" cy="304800"/>
+                  <wp:effectExtent t="0" r="0" b="0" l="0"/>
+                  <wp:docPr id="1" name="" descr="" title=""/>
+                  <wp:cNvGraphicFramePr>
+                    <a:graphicFrameLocks xmlns:a="http://schemas.openxmlformats.org/drawingml/2006/main" noChangeAspect="1"/>
+                  </wp:cNvGraphicFramePr>
+                  <a:graphic xmlns:a="http://schemas.openxmlformats.org/drawingml/2006/main">
+                    <a:graphicData uri="http://schemas.openxmlformats.org/drawingml/2006/picture">
+                      <pic:pic xmlns:pic="http://schemas.openxmlformats.org/drawingml/2006/picture">
+                        <pic:nvPicPr>
+                          <pic:cNvPr id="0" name="" descr=""/>
+                          <pic:cNvPicPr>
+                            <a:picLocks noChangeAspect="1" noChangeArrowheads="1"/>
+                          </pic:cNvPicPr>
+                        </pic:nvPicPr>
+                        <pic:blipFill>
+                          <a:blip r:embed="rId23" cstate="none"/>
+                          <a:srcRect/>
+                          <a:stretch>
+                            <a:fillRect/>
+                          </a:stretch>
+                        </pic:blipFill>
+                        <pic:spPr bwMode="auto">
+                          <a:xfrm>
+                            <a:off x="0" y="0"/>
+                            <a:ext cx="304800" cy="304800"/>
+                          </a:xfrm>
+                          <a:prstGeom prst="rect">
+                            <a:avLst/>
+                          </a:prstGeom>
+                        </pic:spPr>
+                      </pic:pic>
+                    </a:graphicData>
+                  </a:graphic>
+                </wp:inline>
+              </w:drawing>
+            </w:r>
+          </w:p>
+          <w:p>
+            <w:pPr>
+              <w:spacing w:before="10"/>
+              <w:jc w:val="center"/>
+            </w:pPr>
+            <w:r>
+              <w:rPr>
+                <w:rFonts w:ascii="Calibri" w:cs="Calibri" w:eastAsia="Calibri" w:hAnsi="Calibri"/>
+                <w:b/>
+                <w:bCs/>
+                <w:color w:val="B0206B"/>
+                <w:sz w:val="10"/>
+                <w:szCs w:val="10"/>
+              </w:rPr>
+              <w:t xml:space="preserve">17</w:t>
+            </w:r>
+          </w:p>
+        </w:tc>
+        <w:tc>
+          <w:tcPr>
+            <w:tcW w:type="dxa" w:w="1204"/>
+            <w:tcBorders>
+              <w:top w:val="none" w:color="FFFFFF" w:sz="0"/>
+              <w:left w:val="none" w:color="FFFFFF" w:sz="0"/>
+              <w:bottom w:val="none" w:color="FFFFFF" w:sz="0"/>
+              <w:right w:val="none" w:color="FFFFFF" w:sz="0"/>
+            </w:tcBorders>
+            <w:tcMar>
+              <w:top w:type="dxa" w:w="18"/>
+              <w:left w:type="dxa" w:w="20"/>
+              <w:bottom w:type="dxa" w:w="18"/>
+              <w:right w:type="dxa" w:w="20"/>
+            </w:tcMar>
+          </w:tcPr>
+          <w:p>
+            <w:pPr>
+              <w:jc w:val="center"/>
+            </w:pPr>
+            <w:r>
+              <w:drawing>
+                <wp:inline distT="0" distB="0" distL="0" distR="0">
+                  <wp:extent cx="304800" cy="304800"/>
+                  <wp:effectExtent t="0" r="0" b="0" l="0"/>
+                  <wp:docPr id="1" name="" descr="" title=""/>
+                  <wp:cNvGraphicFramePr>
+                    <a:graphicFrameLocks xmlns:a="http://schemas.openxmlformats.org/drawingml/2006/main" noChangeAspect="1"/>
+                  </wp:cNvGraphicFramePr>
+                  <a:graphic xmlns:a="http://schemas.openxmlformats.org/drawingml/2006/main">
+                    <a:graphicData uri="http://schemas.openxmlformats.org/drawingml/2006/picture">
+                      <pic:pic xmlns:pic="http://schemas.openxmlformats.org/drawingml/2006/picture">
+                        <pic:nvPicPr>
+                          <pic:cNvPr id="0" name="" descr=""/>
+                          <pic:cNvPicPr>
+                            <a:picLocks noChangeAspect="1" noChangeArrowheads="1"/>
+                          </pic:cNvPicPr>
+                        </pic:nvPicPr>
+                        <pic:blipFill>
+                          <a:blip r:embed="rId24" cstate="none"/>
+                          <a:srcRect/>
+                          <a:stretch>
+                            <a:fillRect/>
+                          </a:stretch>
+                        </pic:blipFill>
+                        <pic:spPr bwMode="auto">
+                          <a:xfrm>
+                            <a:off x="0" y="0"/>
+                            <a:ext cx="304800" cy="304800"/>
+                          </a:xfrm>
+                          <a:prstGeom prst="rect">
+                            <a:avLst/>
+                          </a:prstGeom>
+                        </pic:spPr>
+                      </pic:pic>
+                    </a:graphicData>
+                  </a:graphic>
+                </wp:inline>
+              </w:drawing>
+            </w:r>
+          </w:p>
+          <w:p>
+            <w:pPr>
+              <w:spacing w:before="10"/>
+              <w:jc w:val="center"/>
+            </w:pPr>
+            <w:r>
+              <w:rPr>
+                <w:rFonts w:ascii="Calibri" w:cs="Calibri" w:eastAsia="Calibri" w:hAnsi="Calibri"/>
+                <w:b/>
+                <w:bCs/>
+                <w:color w:val="B0206B"/>
+                <w:sz w:val="10"/>
+                <w:szCs w:val="10"/>
+              </w:rPr>
+              <w:t xml:space="preserve">18</w:t>
             </w:r>
           </w:p>
         </w:tc>
@@ -1504,7 +1817,7 @@
         <w:pBdr>
           <w:bottom w:val="single" w:color="E0338C" w:sz="8" w:space="4"/>
         </w:pBdr>
-        <w:spacing w:after="40" w:before="100"/>
+        <w:spacing w:after="30" w:before="75"/>
       </w:pPr>
       <w:r>
         <w:rPr>
@@ -1788,7 +2101,7 @@
         <w:pBdr>
           <w:bottom w:val="single" w:color="E0338C" w:sz="8" w:space="4"/>
         </w:pBdr>
-        <w:spacing w:after="40" w:before="100"/>
+        <w:spacing w:after="30" w:before="75"/>
       </w:pPr>
       <w:r>
         <w:rPr>
@@ -1835,7 +2148,7 @@
         <w:pBdr>
           <w:bottom w:val="single" w:color="E0338C" w:sz="8" w:space="4"/>
         </w:pBdr>
-        <w:spacing w:after="40" w:before="100"/>
+        <w:spacing w:after="30" w:before="75"/>
       </w:pPr>
       <w:r>
         <w:rPr>
@@ -2132,7 +2445,7 @@
     </w:p>
     <w:sectPr>
       <w:pgSz w:w="12240" w:h="15840" w:orient="portrait"/>
-      <w:pgMar w:top="420" w:right="620" w:bottom="420" w:left="620" w:header="708" w:footer="708" w:gutter="0"/>
+      <w:pgMar w:top="340" w:right="560" w:bottom="340" w:left="560" w:header="708" w:footer="708" w:gutter="0"/>
       <w:pgNumType/>
       <w:docGrid w:linePitch="360"/>
     </w:sectPr>

</xml_diff>